<commit_message>
almost done with IA2
</commit_message>
<xml_diff>
--- a/41IA Intelektualnyj analiz danyh/2/BZ_KNT-122_Onyshchenko_19_PR2.docx
+++ b/41IA Intelektualnyj analiz danyh/2/BZ_KNT-122_Onyshchenko_19_PR2.docx
@@ -986,11 +986,789 @@
       </w:pPr>
       <w:r>
         <w:rPr/>
-      </w:r>
-    </w:p>
-    <w:p>
-      <w:pPr>
-        <w:pStyle w:val="p11"/>
+        <w:t>Після запуску коду отримано такі графіки:</w:t>
+      </w:r>
+    </w:p>
+    <w:p>
+      <w:pPr>
+        <w:pStyle w:val="img11"/>
+        <w:rPr/>
+      </w:pPr>
+      <w:r>
+        <w:rPr/>
+      </w:r>
+    </w:p>
+    <w:p>
+      <w:pPr>
+        <w:pStyle w:val="img11"/>
+        <w:rPr/>
+      </w:pPr>
+      <w:r>
+        <w:rPr/>
+        <w:drawing>
+          <wp:inline distT="0" distB="0" distL="0" distR="0">
+            <wp:extent cx="4582795" cy="3436620"/>
+            <wp:effectExtent l="0" t="0" r="0" b="0"/>
+            <wp:docPr id="2" name="Зображення2"/>
+            <wp:cNvGraphicFramePr>
+              <a:graphicFrameLocks xmlns:a="http://schemas.openxmlformats.org/drawingml/2006/main" noChangeAspect="1"/>
+            </wp:cNvGraphicFramePr>
+            <a:graphic xmlns:a="http://schemas.openxmlformats.org/drawingml/2006/main">
+              <a:graphicData uri="http://schemas.openxmlformats.org/drawingml/2006/picture">
+                <pic:pic xmlns:pic="http://schemas.openxmlformats.org/drawingml/2006/picture">
+                  <pic:nvPicPr>
+                    <pic:cNvPr id="2" name="Зображення2"/>
+                    <pic:cNvPicPr>
+                      <a:picLocks noChangeAspect="1" noChangeArrowheads="1"/>
+                    </pic:cNvPicPr>
+                  </pic:nvPicPr>
+                  <pic:blipFill>
+                    <a:blip r:embed="rId4"/>
+                    <a:stretch>
+                      <a:fillRect/>
+                    </a:stretch>
+                  </pic:blipFill>
+                  <pic:spPr bwMode="auto">
+                    <a:xfrm>
+                      <a:off x="0" y="0"/>
+                      <a:ext cx="4582795" cy="3436620"/>
+                    </a:xfrm>
+                    <a:prstGeom prst="rect">
+                      <a:avLst/>
+                    </a:prstGeom>
+                    <a:noFill/>
+                  </pic:spPr>
+                </pic:pic>
+              </a:graphicData>
+            </a:graphic>
+          </wp:inline>
+        </w:drawing>
+      </w:r>
+    </w:p>
+    <w:p>
+      <w:pPr>
+        <w:pStyle w:val="img11"/>
+        <w:rPr/>
+      </w:pPr>
+      <w:r>
+        <w:rPr/>
+        <w:t xml:space="preserve">Рисунок 1.2 — Графік </w:t>
+      </w:r>
+      <w:r>
+        <w:rPr>
+          <w:lang w:val="en-US"/>
+        </w:rPr>
+        <w:t>bar</w:t>
+      </w:r>
+    </w:p>
+    <w:p>
+      <w:pPr>
+        <w:pStyle w:val="img11"/>
+        <w:rPr/>
+      </w:pPr>
+      <w:r>
+        <w:rPr/>
+      </w:r>
+    </w:p>
+    <w:p>
+      <w:pPr>
+        <w:pStyle w:val="img11"/>
+        <w:rPr/>
+      </w:pPr>
+      <w:r>
+        <w:rPr/>
+        <w:drawing>
+          <wp:inline distT="0" distB="0" distL="0" distR="0">
+            <wp:extent cx="4596765" cy="3447415"/>
+            <wp:effectExtent l="0" t="0" r="0" b="0"/>
+            <wp:docPr id="3" name="Зображення3"/>
+            <wp:cNvGraphicFramePr>
+              <a:graphicFrameLocks xmlns:a="http://schemas.openxmlformats.org/drawingml/2006/main" noChangeAspect="1"/>
+            </wp:cNvGraphicFramePr>
+            <a:graphic xmlns:a="http://schemas.openxmlformats.org/drawingml/2006/main">
+              <a:graphicData uri="http://schemas.openxmlformats.org/drawingml/2006/picture">
+                <pic:pic xmlns:pic="http://schemas.openxmlformats.org/drawingml/2006/picture">
+                  <pic:nvPicPr>
+                    <pic:cNvPr id="3" name="Зображення3"/>
+                    <pic:cNvPicPr>
+                      <a:picLocks noChangeAspect="1" noChangeArrowheads="1"/>
+                    </pic:cNvPicPr>
+                  </pic:nvPicPr>
+                  <pic:blipFill>
+                    <a:blip r:embed="rId5"/>
+                    <a:stretch>
+                      <a:fillRect/>
+                    </a:stretch>
+                  </pic:blipFill>
+                  <pic:spPr bwMode="auto">
+                    <a:xfrm>
+                      <a:off x="0" y="0"/>
+                      <a:ext cx="4596765" cy="3447415"/>
+                    </a:xfrm>
+                    <a:prstGeom prst="rect">
+                      <a:avLst/>
+                    </a:prstGeom>
+                    <a:noFill/>
+                  </pic:spPr>
+                </pic:pic>
+              </a:graphicData>
+            </a:graphic>
+          </wp:inline>
+        </w:drawing>
+      </w:r>
+    </w:p>
+    <w:p>
+      <w:pPr>
+        <w:pStyle w:val="img11"/>
+        <w:rPr/>
+      </w:pPr>
+      <w:r>
+        <w:rPr/>
+        <w:t xml:space="preserve">Рисунок 1.3 — Графік </w:t>
+      </w:r>
+      <w:r>
+        <w:rPr>
+          <w:lang w:val="en-US"/>
+        </w:rPr>
+        <w:t>hist</w:t>
+      </w:r>
+    </w:p>
+    <w:p>
+      <w:pPr>
+        <w:pStyle w:val="img11"/>
+        <w:rPr/>
+      </w:pPr>
+      <w:r>
+        <w:rPr/>
+      </w:r>
+    </w:p>
+    <w:p>
+      <w:pPr>
+        <w:pStyle w:val="img11"/>
+        <w:rPr/>
+      </w:pPr>
+      <w:r>
+        <w:rPr/>
+        <w:drawing>
+          <wp:inline distT="0" distB="0" distL="0" distR="0">
+            <wp:extent cx="5581015" cy="4185920"/>
+            <wp:effectExtent l="0" t="0" r="0" b="0"/>
+            <wp:docPr id="4" name="Зображення4"/>
+            <wp:cNvGraphicFramePr>
+              <a:graphicFrameLocks xmlns:a="http://schemas.openxmlformats.org/drawingml/2006/main" noChangeAspect="1"/>
+            </wp:cNvGraphicFramePr>
+            <a:graphic xmlns:a="http://schemas.openxmlformats.org/drawingml/2006/main">
+              <a:graphicData uri="http://schemas.openxmlformats.org/drawingml/2006/picture">
+                <pic:pic xmlns:pic="http://schemas.openxmlformats.org/drawingml/2006/picture">
+                  <pic:nvPicPr>
+                    <pic:cNvPr id="4" name="Зображення4"/>
+                    <pic:cNvPicPr>
+                      <a:picLocks noChangeAspect="1" noChangeArrowheads="1"/>
+                    </pic:cNvPicPr>
+                  </pic:nvPicPr>
+                  <pic:blipFill>
+                    <a:blip r:embed="rId6"/>
+                    <a:stretch>
+                      <a:fillRect/>
+                    </a:stretch>
+                  </pic:blipFill>
+                  <pic:spPr bwMode="auto">
+                    <a:xfrm>
+                      <a:off x="0" y="0"/>
+                      <a:ext cx="5581015" cy="4185920"/>
+                    </a:xfrm>
+                    <a:prstGeom prst="rect">
+                      <a:avLst/>
+                    </a:prstGeom>
+                    <a:noFill/>
+                  </pic:spPr>
+                </pic:pic>
+              </a:graphicData>
+            </a:graphic>
+          </wp:inline>
+        </w:drawing>
+      </w:r>
+    </w:p>
+    <w:p>
+      <w:pPr>
+        <w:pStyle w:val="img11"/>
+        <w:rPr/>
+      </w:pPr>
+      <w:r>
+        <w:rPr/>
+        <w:t xml:space="preserve">Рисунок 1.4 — Графік </w:t>
+      </w:r>
+      <w:r>
+        <w:rPr>
+          <w:lang w:val="en-US"/>
+        </w:rPr>
+        <w:t>pie</w:t>
+      </w:r>
+    </w:p>
+    <w:p>
+      <w:pPr>
+        <w:pStyle w:val="img11"/>
+        <w:rPr/>
+      </w:pPr>
+      <w:r>
+        <w:rPr/>
+      </w:r>
+    </w:p>
+    <w:p>
+      <w:pPr>
+        <w:pStyle w:val="img11"/>
+        <w:rPr/>
+      </w:pPr>
+      <w:r>
+        <w:rPr/>
+        <w:drawing>
+          <wp:inline distT="0" distB="0" distL="0" distR="0">
+            <wp:extent cx="4391025" cy="3293110"/>
+            <wp:effectExtent l="0" t="0" r="0" b="0"/>
+            <wp:docPr id="5" name="Зображення5"/>
+            <wp:cNvGraphicFramePr>
+              <a:graphicFrameLocks xmlns:a="http://schemas.openxmlformats.org/drawingml/2006/main" noChangeAspect="1"/>
+            </wp:cNvGraphicFramePr>
+            <a:graphic xmlns:a="http://schemas.openxmlformats.org/drawingml/2006/main">
+              <a:graphicData uri="http://schemas.openxmlformats.org/drawingml/2006/picture">
+                <pic:pic xmlns:pic="http://schemas.openxmlformats.org/drawingml/2006/picture">
+                  <pic:nvPicPr>
+                    <pic:cNvPr id="5" name="Зображення5"/>
+                    <pic:cNvPicPr>
+                      <a:picLocks noChangeAspect="1" noChangeArrowheads="1"/>
+                    </pic:cNvPicPr>
+                  </pic:nvPicPr>
+                  <pic:blipFill>
+                    <a:blip r:embed="rId7"/>
+                    <a:stretch>
+                      <a:fillRect/>
+                    </a:stretch>
+                  </pic:blipFill>
+                  <pic:spPr bwMode="auto">
+                    <a:xfrm>
+                      <a:off x="0" y="0"/>
+                      <a:ext cx="4391025" cy="3293110"/>
+                    </a:xfrm>
+                    <a:prstGeom prst="rect">
+                      <a:avLst/>
+                    </a:prstGeom>
+                    <a:noFill/>
+                  </pic:spPr>
+                </pic:pic>
+              </a:graphicData>
+            </a:graphic>
+          </wp:inline>
+        </w:drawing>
+      </w:r>
+    </w:p>
+    <w:p>
+      <w:pPr>
+        <w:pStyle w:val="img11"/>
+        <w:rPr/>
+      </w:pPr>
+      <w:r>
+        <w:rPr/>
+        <w:t xml:space="preserve">Рисунок 1.5 — Графік </w:t>
+      </w:r>
+      <w:r>
+        <w:rPr>
+          <w:lang w:val="en-US"/>
+        </w:rPr>
+        <w:t>hist</w:t>
+      </w:r>
+    </w:p>
+    <w:p>
+      <w:pPr>
+        <w:pStyle w:val="p11"/>
+        <w:rPr/>
+      </w:pPr>
+      <w:r>
+        <w:rPr/>
+      </w:r>
+    </w:p>
+    <w:p>
+      <w:pPr>
+        <w:pStyle w:val="H2"/>
+        <w:rPr/>
+      </w:pPr>
+      <w:r>
+        <w:rPr/>
+        <w:t>Код</w:t>
+      </w:r>
+    </w:p>
+    <w:p>
+      <w:pPr>
+        <w:pStyle w:val="Code"/>
+        <w:rPr>
+          <w:color w:val="auto"/>
+        </w:rPr>
+      </w:pPr>
+      <w:r>
+        <w:rPr>
+          <w:color w:val="auto"/>
+        </w:rPr>
+      </w:r>
+    </w:p>
+    <w:p>
+      <w:pPr>
+        <w:pStyle w:val="Code"/>
+        <w:rPr>
+          <w:color w:val="auto"/>
+        </w:rPr>
+      </w:pPr>
+      <w:r>
+        <w:rPr>
+          <w:color w:val="auto"/>
+        </w:rPr>
+        <w:t>import os</w:t>
+      </w:r>
+    </w:p>
+    <w:p>
+      <w:pPr>
+        <w:pStyle w:val="Code"/>
+        <w:rPr>
+          <w:color w:val="auto"/>
+        </w:rPr>
+      </w:pPr>
+      <w:r>
+        <w:rPr>
+          <w:color w:val="auto"/>
+        </w:rPr>
+        <w:t>import pandas as pd</w:t>
+      </w:r>
+    </w:p>
+    <w:p>
+      <w:pPr>
+        <w:pStyle w:val="Code"/>
+        <w:rPr>
+          <w:color w:val="auto"/>
+        </w:rPr>
+      </w:pPr>
+      <w:r>
+        <w:rPr>
+          <w:color w:val="auto"/>
+        </w:rPr>
+        <w:t>from matplotlib import pyplot as plt</w:t>
+      </w:r>
+    </w:p>
+    <w:p>
+      <w:pPr>
+        <w:pStyle w:val="Code"/>
+        <w:rPr>
+          <w:color w:val="auto"/>
+        </w:rPr>
+      </w:pPr>
+      <w:r>
+        <w:rPr>
+          <w:color w:val="auto"/>
+        </w:rPr>
+      </w:r>
+    </w:p>
+    <w:p>
+      <w:pPr>
+        <w:pStyle w:val="Code"/>
+        <w:rPr>
+          <w:color w:val="auto"/>
+        </w:rPr>
+      </w:pPr>
+      <w:r>
+        <w:rPr>
+          <w:color w:val="auto"/>
+        </w:rPr>
+        <w:t># Load data</w:t>
+      </w:r>
+    </w:p>
+    <w:p>
+      <w:pPr>
+        <w:pStyle w:val="Code"/>
+        <w:rPr>
+          <w:color w:val="auto"/>
+        </w:rPr>
+      </w:pPr>
+      <w:r>
+        <w:rPr>
+          <w:color w:val="auto"/>
+        </w:rPr>
+        <w:t>root_folder = os.path.dirname(os.path.abspath(__file__))</w:t>
+      </w:r>
+    </w:p>
+    <w:p>
+      <w:pPr>
+        <w:pStyle w:val="Code"/>
+        <w:rPr>
+          <w:color w:val="auto"/>
+        </w:rPr>
+      </w:pPr>
+      <w:r>
+        <w:rPr>
+          <w:color w:val="auto"/>
+        </w:rPr>
+        <w:t>file_name = "breast-cancer.csv"</w:t>
+      </w:r>
+    </w:p>
+    <w:p>
+      <w:pPr>
+        <w:pStyle w:val="Code"/>
+        <w:rPr>
+          <w:color w:val="auto"/>
+        </w:rPr>
+      </w:pPr>
+      <w:r>
+        <w:rPr>
+          <w:color w:val="auto"/>
+        </w:rPr>
+        <w:t>file_path = os.path.join(root_folder, "data", file_name)</w:t>
+      </w:r>
+    </w:p>
+    <w:p>
+      <w:pPr>
+        <w:pStyle w:val="Code"/>
+        <w:rPr>
+          <w:color w:val="auto"/>
+        </w:rPr>
+      </w:pPr>
+      <w:r>
+        <w:rPr>
+          <w:color w:val="auto"/>
+        </w:rPr>
+      </w:r>
+    </w:p>
+    <w:p>
+      <w:pPr>
+        <w:pStyle w:val="Code"/>
+        <w:rPr>
+          <w:color w:val="auto"/>
+        </w:rPr>
+      </w:pPr>
+      <w:r>
+        <w:rPr>
+          <w:color w:val="auto"/>
+        </w:rPr>
+        <w:t># Print table</w:t>
+      </w:r>
+    </w:p>
+    <w:p>
+      <w:pPr>
+        <w:pStyle w:val="Code"/>
+        <w:rPr>
+          <w:color w:val="auto"/>
+        </w:rPr>
+      </w:pPr>
+      <w:r>
+        <w:rPr>
+          <w:color w:val="auto"/>
+        </w:rPr>
+        <w:t>data = pd.read_csv(file_path, na_values=["?"])</w:t>
+      </w:r>
+    </w:p>
+    <w:p>
+      <w:pPr>
+        <w:pStyle w:val="Code"/>
+        <w:rPr>
+          <w:color w:val="auto"/>
+        </w:rPr>
+      </w:pPr>
+      <w:r>
+        <w:rPr>
+          <w:color w:val="auto"/>
+        </w:rPr>
+        <w:t>print(data.head())</w:t>
+      </w:r>
+    </w:p>
+    <w:p>
+      <w:pPr>
+        <w:pStyle w:val="Code"/>
+        <w:rPr>
+          <w:color w:val="auto"/>
+        </w:rPr>
+      </w:pPr>
+      <w:r>
+        <w:rPr>
+          <w:color w:val="auto"/>
+        </w:rPr>
+        <w:t>print()</w:t>
+      </w:r>
+    </w:p>
+    <w:p>
+      <w:pPr>
+        <w:pStyle w:val="Code"/>
+        <w:rPr>
+          <w:color w:val="auto"/>
+        </w:rPr>
+      </w:pPr>
+      <w:r>
+        <w:rPr>
+          <w:color w:val="auto"/>
+        </w:rPr>
+      </w:r>
+    </w:p>
+    <w:p>
+      <w:pPr>
+        <w:pStyle w:val="Code"/>
+        <w:rPr>
+          <w:color w:val="auto"/>
+        </w:rPr>
+      </w:pPr>
+      <w:r>
+        <w:rPr>
+          <w:color w:val="auto"/>
+        </w:rPr>
+        <w:t># Fill missing values</w:t>
+      </w:r>
+    </w:p>
+    <w:p>
+      <w:pPr>
+        <w:pStyle w:val="Code"/>
+        <w:rPr>
+          <w:color w:val="auto"/>
+        </w:rPr>
+      </w:pPr>
+      <w:r>
+        <w:rPr>
+          <w:color w:val="auto"/>
+        </w:rPr>
+        <w:t>data["node-caps"] = data["node-caps"].fillna(data["node-caps"].mode())</w:t>
+      </w:r>
+    </w:p>
+    <w:p>
+      <w:pPr>
+        <w:pStyle w:val="Code"/>
+        <w:rPr>
+          <w:color w:val="auto"/>
+        </w:rPr>
+      </w:pPr>
+      <w:r>
+        <w:rPr>
+          <w:color w:val="auto"/>
+        </w:rPr>
+        <w:t>print(data.head())</w:t>
+      </w:r>
+    </w:p>
+    <w:p>
+      <w:pPr>
+        <w:pStyle w:val="Code"/>
+        <w:rPr>
+          <w:color w:val="auto"/>
+        </w:rPr>
+      </w:pPr>
+      <w:r>
+        <w:rPr>
+          <w:color w:val="auto"/>
+        </w:rPr>
+      </w:r>
+    </w:p>
+    <w:p>
+      <w:pPr>
+        <w:pStyle w:val="Code"/>
+        <w:rPr>
+          <w:color w:val="auto"/>
+        </w:rPr>
+      </w:pPr>
+      <w:r>
+        <w:rPr>
+          <w:color w:val="auto"/>
+        </w:rPr>
+        <w:t># Replace categorical with numbers</w:t>
+      </w:r>
+    </w:p>
+    <w:p>
+      <w:pPr>
+        <w:pStyle w:val="Code"/>
+        <w:rPr>
+          <w:color w:val="auto"/>
+        </w:rPr>
+      </w:pPr>
+      <w:r>
+        <w:rPr>
+          <w:color w:val="auto"/>
+        </w:rPr>
+        <w:t>data["node-caps"].replace({"yes": 1, "no": 0}, inplace=True)</w:t>
+      </w:r>
+    </w:p>
+    <w:p>
+      <w:pPr>
+        <w:pStyle w:val="Code"/>
+        <w:rPr>
+          <w:color w:val="auto"/>
+        </w:rPr>
+      </w:pPr>
+      <w:r>
+        <w:rPr>
+          <w:color w:val="auto"/>
+        </w:rPr>
+        <w:t>data["breast"].replace({"left": 1, "right": 0}, inplace=True)</w:t>
+      </w:r>
+    </w:p>
+    <w:p>
+      <w:pPr>
+        <w:pStyle w:val="Code"/>
+        <w:rPr>
+          <w:color w:val="auto"/>
+        </w:rPr>
+      </w:pPr>
+      <w:r>
+        <w:rPr>
+          <w:color w:val="auto"/>
+        </w:rPr>
+        <w:t>data["irradiat"].replace({"yes": 1, "no": 0}, inplace=True)</w:t>
+      </w:r>
+    </w:p>
+    <w:p>
+      <w:pPr>
+        <w:pStyle w:val="Code"/>
+        <w:rPr>
+          <w:color w:val="auto"/>
+        </w:rPr>
+      </w:pPr>
+      <w:r>
+        <w:rPr>
+          <w:color w:val="auto"/>
+        </w:rPr>
+        <w:t>print(data.head())</w:t>
+      </w:r>
+    </w:p>
+    <w:p>
+      <w:pPr>
+        <w:pStyle w:val="Code"/>
+        <w:rPr>
+          <w:color w:val="auto"/>
+        </w:rPr>
+      </w:pPr>
+      <w:r>
+        <w:rPr>
+          <w:color w:val="auto"/>
+        </w:rPr>
+      </w:r>
+    </w:p>
+    <w:p>
+      <w:pPr>
+        <w:pStyle w:val="Code"/>
+        <w:rPr>
+          <w:color w:val="auto"/>
+        </w:rPr>
+      </w:pPr>
+      <w:r>
+        <w:rPr>
+          <w:color w:val="auto"/>
+        </w:rPr>
+        <w:t># Pie</w:t>
+      </w:r>
+    </w:p>
+    <w:p>
+      <w:pPr>
+        <w:pStyle w:val="Code"/>
+        <w:rPr>
+          <w:color w:val="auto"/>
+        </w:rPr>
+      </w:pPr>
+      <w:r>
+        <w:rPr>
+          <w:color w:val="auto"/>
+        </w:rPr>
+        <w:t>data.head().plot(kind="pie", y="deg-malig")</w:t>
+      </w:r>
+    </w:p>
+    <w:p>
+      <w:pPr>
+        <w:pStyle w:val="Code"/>
+        <w:rPr>
+          <w:color w:val="auto"/>
+        </w:rPr>
+      </w:pPr>
+      <w:r>
+        <w:rPr>
+          <w:color w:val="auto"/>
+        </w:rPr>
+        <w:t># Hist</w:t>
+      </w:r>
+    </w:p>
+    <w:p>
+      <w:pPr>
+        <w:pStyle w:val="Code"/>
+        <w:rPr>
+          <w:color w:val="auto"/>
+        </w:rPr>
+      </w:pPr>
+      <w:r>
+        <w:rPr>
+          <w:color w:val="auto"/>
+        </w:rPr>
+        <w:t>data.hist(column="deg-malig")</w:t>
+      </w:r>
+    </w:p>
+    <w:p>
+      <w:pPr>
+        <w:pStyle w:val="Code"/>
+        <w:rPr>
+          <w:color w:val="auto"/>
+        </w:rPr>
+      </w:pPr>
+      <w:r>
+        <w:rPr>
+          <w:color w:val="auto"/>
+        </w:rPr>
+        <w:t># Scatter</w:t>
+      </w:r>
+    </w:p>
+    <w:p>
+      <w:pPr>
+        <w:pStyle w:val="Code"/>
+        <w:rPr>
+          <w:color w:val="auto"/>
+        </w:rPr>
+      </w:pPr>
+      <w:r>
+        <w:rPr>
+          <w:color w:val="auto"/>
+        </w:rPr>
+        <w:t>data.plot(kind="scatter", x="age", y="tumor-size")</w:t>
+      </w:r>
+    </w:p>
+    <w:p>
+      <w:pPr>
+        <w:pStyle w:val="Code"/>
+        <w:rPr>
+          <w:color w:val="auto"/>
+        </w:rPr>
+      </w:pPr>
+      <w:r>
+        <w:rPr>
+          <w:color w:val="auto"/>
+        </w:rPr>
+        <w:t># Bar</w:t>
+      </w:r>
+    </w:p>
+    <w:p>
+      <w:pPr>
+        <w:pStyle w:val="Code"/>
+        <w:rPr>
+          <w:color w:val="auto"/>
+        </w:rPr>
+      </w:pPr>
+      <w:r>
+        <w:rPr>
+          <w:color w:val="auto"/>
+        </w:rPr>
+        <w:t>data.head().plot(kind="bar", y="deg-malig")</w:t>
+      </w:r>
+    </w:p>
+    <w:p>
+      <w:pPr>
+        <w:pStyle w:val="Code"/>
+        <w:rPr>
+          <w:color w:val="auto"/>
+        </w:rPr>
+      </w:pPr>
+      <w:r>
+        <w:rPr>
+          <w:color w:val="auto"/>
+        </w:rPr>
+        <w:t>plt.show()</w:t>
+      </w:r>
+    </w:p>
+    <w:p>
+      <w:pPr>
+        <w:pStyle w:val="P1"/>
         <w:rPr/>
       </w:pPr>
       <w:r>
@@ -1019,6 +1797,44 @@
     </w:p>
     <w:p>
       <w:pPr>
+        <w:pStyle w:val="P1"/>
+        <w:rPr/>
+      </w:pPr>
+      <w:r>
+        <w:rPr/>
+      </w:r>
+    </w:p>
+    <w:p>
+      <w:pPr>
+        <w:pStyle w:val="P1"/>
+        <w:rPr/>
+      </w:pPr>
+      <w:r>
+        <w:rPr/>
+        <w:t>Якість даних це те, наскільки корисними вони є при застосуванні.</w:t>
+      </w:r>
+    </w:p>
+    <w:p>
+      <w:pPr>
+        <w:pStyle w:val="P1"/>
+        <w:rPr/>
+      </w:pPr>
+      <w:r>
+        <w:rPr/>
+        <w:t>Метою підготовки даних до аналізу є форматування їх для зручнішої роботи.</w:t>
+      </w:r>
+    </w:p>
+    <w:p>
+      <w:pPr>
+        <w:pStyle w:val="P1"/>
+        <w:rPr/>
+      </w:pPr>
+      <w:r>
+        <w:rPr/>
+      </w:r>
+    </w:p>
+    <w:p>
+      <w:pPr>
         <w:pStyle w:val="H2"/>
         <w:rPr/>
       </w:pPr>
@@ -1029,6 +1845,44 @@
     </w:p>
     <w:p>
       <w:pPr>
+        <w:pStyle w:val="P1"/>
+        <w:rPr/>
+      </w:pPr>
+      <w:r>
+        <w:rPr/>
+      </w:r>
+    </w:p>
+    <w:p>
+      <w:pPr>
+        <w:pStyle w:val="P1"/>
+        <w:rPr/>
+      </w:pPr>
+      <w:r>
+        <w:rPr/>
+        <w:t>Атрибут це властивість даних.</w:t>
+      </w:r>
+    </w:p>
+    <w:p>
+      <w:pPr>
+        <w:pStyle w:val="P1"/>
+        <w:rPr/>
+      </w:pPr>
+      <w:r>
+        <w:rPr/>
+        <w:t>Екземпляр це окремий елемент вибірки.</w:t>
+      </w:r>
+    </w:p>
+    <w:p>
+      <w:pPr>
+        <w:pStyle w:val="P1"/>
+        <w:rPr/>
+      </w:pPr>
+      <w:r>
+        <w:rPr/>
+      </w:r>
+    </w:p>
+    <w:p>
+      <w:pPr>
         <w:pStyle w:val="H2"/>
         <w:rPr/>
       </w:pPr>
@@ -1039,6 +1893,54 @@
     </w:p>
     <w:p>
       <w:pPr>
+        <w:pStyle w:val="P1"/>
+        <w:rPr/>
+      </w:pPr>
+      <w:r>
+        <w:rPr/>
+      </w:r>
+    </w:p>
+    <w:p>
+      <w:pPr>
+        <w:pStyle w:val="P1"/>
+        <w:rPr/>
+      </w:pPr>
+      <w:r>
+        <w:rPr/>
+        <w:t>Цільовим називають такий атрибут, який складно виміряти.</w:t>
+      </w:r>
+    </w:p>
+    <w:p>
+      <w:pPr>
+        <w:pStyle w:val="P1"/>
+        <w:rPr/>
+      </w:pPr>
+      <w:r>
+        <w:rPr/>
+        <w:t>Значимий це такий атрибут, який корисний.</w:t>
+      </w:r>
+    </w:p>
+    <w:p>
+      <w:pPr>
+        <w:pStyle w:val="P1"/>
+        <w:rPr/>
+      </w:pPr>
+      <w:r>
+        <w:rPr/>
+        <w:t>Незначимий це атрибут, який можна пропустити.</w:t>
+      </w:r>
+    </w:p>
+    <w:p>
+      <w:pPr>
+        <w:pStyle w:val="P1"/>
+        <w:rPr/>
+      </w:pPr>
+      <w:r>
+        <w:rPr/>
+      </w:r>
+    </w:p>
+    <w:p>
+      <w:pPr>
         <w:pStyle w:val="H2"/>
         <w:rPr/>
       </w:pPr>
@@ -1049,12 +1951,90 @@
     </w:p>
     <w:p>
       <w:pPr>
+        <w:pStyle w:val="P1"/>
+        <w:rPr/>
+      </w:pPr>
+      <w:r>
+        <w:rPr/>
+      </w:r>
+    </w:p>
+    <w:p>
+      <w:pPr>
+        <w:pStyle w:val="P1"/>
+        <w:rPr/>
+      </w:pPr>
+      <w:r>
+        <w:rPr/>
+      </w:r>
+    </w:p>
+    <w:p>
+      <w:pPr>
+        <w:pStyle w:val="P1"/>
+        <w:rPr/>
+      </w:pPr>
+      <w:r>
+        <w:rPr/>
+      </w:r>
+    </w:p>
+    <w:p>
+      <w:pPr>
         <w:pStyle w:val="H2"/>
         <w:rPr/>
       </w:pPr>
       <w:r>
         <w:rPr/>
         <w:t xml:space="preserve">Що таке нормалізація даних та для чого вона використовується? </w:t>
+      </w:r>
+    </w:p>
+    <w:p>
+      <w:pPr>
+        <w:pStyle w:val="P1"/>
+        <w:rPr/>
+      </w:pPr>
+      <w:r>
+        <w:rPr/>
+      </w:r>
+    </w:p>
+    <w:p>
+      <w:pPr>
+        <w:pStyle w:val="P1"/>
+        <w:rPr/>
+      </w:pPr>
+      <w:r>
+        <w:rPr/>
+        <w:t xml:space="preserve">Нормалізація даних це підганяння певної властивості під заданий діапазон (зазвичай </w:t>
+      </w:r>
+      <w:r>
+        <w:rPr>
+          <w:lang w:val="en-US"/>
+        </w:rPr>
+        <w:t xml:space="preserve">[0,1] </w:t>
+      </w:r>
+      <w:r>
+        <w:rPr>
+          <w:lang w:val="uk-UA"/>
+        </w:rPr>
+        <w:t xml:space="preserve">або </w:t>
+      </w:r>
+      <w:r>
+        <w:rPr>
+          <w:lang w:val="en-US"/>
+        </w:rPr>
+        <w:t>[-1,1]).</w:t>
+      </w:r>
+    </w:p>
+    <w:p>
+      <w:pPr>
+        <w:pStyle w:val="P1"/>
+        <w:rPr>
+          <w:lang w:val="uk-UA"/>
+        </w:rPr>
+      </w:pPr>
+      <w:r>
+        <w:rPr>
+          <w:lang w:val="uk-UA"/>
+        </w:rPr>
+        <w:t>Вона використовується для кращого співставлення даних в різних діапазонах.</w:t>
       </w:r>
     </w:p>
     <w:sectPr>

</xml_diff>

<commit_message>
IA finish 2nd lab
</commit_message>
<xml_diff>
--- a/41IA Intelektualnyj analiz danyh/2/BZ_KNT-122_Onyshchenko_19_PR2.docx
+++ b/41IA Intelektualnyj analiz danyh/2/BZ_KNT-122_Onyshchenko_19_PR2.docx
@@ -151,15 +151,7 @@
       </w:pPr>
       <w:r>
         <w:rPr/>
-        <w:t>Тема «</w:t>
-      </w:r>
-      <w:r>
-        <w:rPr/>
-        <w:t>Основи попередньої обробки даних</w:t>
-      </w:r>
-      <w:r>
-        <w:rPr/>
-        <w:t>»</w:t>
+        <w:t>Тема «Основи попередньої обробки даних»</w:t>
       </w:r>
     </w:p>
     <w:p>
@@ -438,15 +430,7 @@
       </w:pPr>
       <w:r>
         <w:rPr/>
-        <w:t xml:space="preserve">Метою роботи є </w:t>
-      </w:r>
-      <w:r>
-        <w:rPr/>
-        <w:t xml:space="preserve">ознайомитися та тримати навички роботи з програмою WEKA </w:t>
-      </w:r>
-      <w:r>
-        <w:rPr/>
-        <w:t xml:space="preserve">бібліотеками мови програмування Python для проведення аналізу даних. На практиці вивчити методи попередньої обробки даних для задач інтелектуального аналізу даних. </w:t>
+        <w:t xml:space="preserve">Метою роботи є ознайомитися та тримати навички роботи з програмою WEKA бібліотеками мови програмування Python для проведення аналізу даних. На практиці вивчити методи попередньої обробки даних для задач інтелектуального аналізу даних. </w:t>
       </w:r>
     </w:p>
     <w:p>
@@ -484,15 +468,7 @@
       </w:pPr>
       <w:r>
         <w:rPr/>
-        <w:t xml:space="preserve">Завдання на роботу </w:t>
-      </w:r>
-      <w:r>
-        <w:rPr/>
-        <w:t>зі сторінки 35</w:t>
-      </w:r>
-      <w:r>
-        <w:rPr/>
-        <w:t>:</w:t>
+        <w:t>Завдання на роботу зі сторінки 35:</w:t>
       </w:r>
     </w:p>
     <w:p>
@@ -651,15 +627,7 @@
       </w:pPr>
       <w:r>
         <w:rPr/>
-        <w:t xml:space="preserve">- визначити чи є екземпляри з відсутніми значеннями. Якщо такі </w:t>
-      </w:r>
-      <w:r>
-        <w:rPr/>
-        <w:t>е</w:t>
-      </w:r>
-      <w:r>
-        <w:rPr/>
-        <w:t xml:space="preserve">кземпляри є, то встановити їм відповідні значення використовуючи одну з наведених стратегії поведінки при роботі з пропущеними значеннями; </w:t>
+        <w:t xml:space="preserve">- визначити чи є екземпляри з відсутніми значеннями. Якщо такі екземпляри є, то встановити їм відповідні значення використовуючи одну з наведених стратегії поведінки при роботі з пропущеними значеннями; </w:t>
       </w:r>
     </w:p>
     <w:p>
@@ -1946,7 +1914,11 @@
       </w:pPr>
       <w:r>
         <w:rPr/>
-        <w:t xml:space="preserve">Опишіть підходи для вибору хорошої підмножини атрибутів. Опишіть стратегії поведінки при роботі з пропущеними значеннями атрибутів. </w:t>
+        <w:t>Які функції бібліотеки pandas ви знаєт</w:t>
+      </w:r>
+      <w:r>
+        <w:rPr/>
+        <w:t>е</w:t>
       </w:r>
     </w:p>
     <w:p>
@@ -1965,6 +1937,188 @@
       </w:pPr>
       <w:r>
         <w:rPr/>
+        <w:t xml:space="preserve">Важливі методи бібліотеки </w:t>
+      </w:r>
+      <w:r>
+        <w:rPr>
+          <w:lang w:val="en-US"/>
+        </w:rPr>
+        <w:t>pandas:</w:t>
+      </w:r>
+    </w:p>
+    <w:p>
+      <w:pPr>
+        <w:pStyle w:val="P1"/>
+        <w:rPr>
+          <w:lang w:val="en-US"/>
+        </w:rPr>
+      </w:pPr>
+      <w:r>
+        <w:rPr>
+          <w:lang w:val="en-US"/>
+        </w:rPr>
+      </w:r>
+    </w:p>
+    <w:p>
+      <w:pPr>
+        <w:pStyle w:val="P1"/>
+        <w:widowControl/>
+        <w:numPr>
+          <w:ilvl w:val="0"/>
+          <w:numId w:val="2"/>
+        </w:numPr>
+        <w:suppressAutoHyphens w:val="true"/>
+        <w:bidi w:val="0"/>
+        <w:spacing w:lineRule="auto" w:line="360" w:before="0" w:after="0"/>
+        <w:ind w:hanging="0" w:left="850" w:right="0"/>
+        <w:jc w:val="both"/>
+        <w:rPr>
+          <w:lang w:val="en-US"/>
+        </w:rPr>
+      </w:pPr>
+      <w:r>
+        <w:rPr>
+          <w:lang w:val="en-US"/>
+        </w:rPr>
+        <w:t xml:space="preserve">read_csv(): </w:t>
+      </w:r>
+      <w:r>
+        <w:rPr>
+          <w:lang w:val="uk-UA"/>
+        </w:rPr>
+        <w:t>читає дані з файлу .</w:t>
+      </w:r>
+      <w:r>
+        <w:rPr>
+          <w:lang w:val="en-US"/>
+        </w:rPr>
+        <w:t>csv;</w:t>
+      </w:r>
+    </w:p>
+    <w:p>
+      <w:pPr>
+        <w:pStyle w:val="P1"/>
+        <w:widowControl/>
+        <w:numPr>
+          <w:ilvl w:val="0"/>
+          <w:numId w:val="2"/>
+        </w:numPr>
+        <w:suppressAutoHyphens w:val="true"/>
+        <w:bidi w:val="0"/>
+        <w:spacing w:lineRule="auto" w:line="360" w:before="0" w:after="0"/>
+        <w:ind w:hanging="0" w:left="850" w:right="0"/>
+        <w:jc w:val="both"/>
+        <w:rPr>
+          <w:lang w:val="en-US"/>
+        </w:rPr>
+      </w:pPr>
+      <w:r>
+        <w:rPr>
+          <w:lang w:val="en-US"/>
+        </w:rPr>
+        <w:t xml:space="preserve">head(): </w:t>
+      </w:r>
+      <w:r>
+        <w:rPr>
+          <w:lang w:val="uk-UA"/>
+        </w:rPr>
+        <w:t xml:space="preserve">видає перші </w:t>
+      </w:r>
+      <w:r>
+        <w:rPr>
+          <w:lang w:val="en-US"/>
+        </w:rPr>
+        <w:t>n (</w:t>
+      </w:r>
+      <w:r>
+        <w:rPr>
+          <w:lang w:val="uk-UA"/>
+        </w:rPr>
+        <w:t>за замовчуванням 5) рядків;</w:t>
+      </w:r>
+    </w:p>
+    <w:p>
+      <w:pPr>
+        <w:pStyle w:val="P1"/>
+        <w:widowControl/>
+        <w:numPr>
+          <w:ilvl w:val="0"/>
+          <w:numId w:val="2"/>
+        </w:numPr>
+        <w:suppressAutoHyphens w:val="true"/>
+        <w:bidi w:val="0"/>
+        <w:spacing w:lineRule="auto" w:line="360" w:before="0" w:after="0"/>
+        <w:ind w:hanging="0" w:left="850" w:right="0"/>
+        <w:jc w:val="both"/>
+        <w:rPr>
+          <w:lang w:val="en-US"/>
+        </w:rPr>
+      </w:pPr>
+      <w:r>
+        <w:rPr>
+          <w:lang w:val="en-US"/>
+        </w:rPr>
+        <w:t xml:space="preserve">shape(): </w:t>
+      </w:r>
+      <w:r>
+        <w:rPr>
+          <w:lang w:val="uk-UA"/>
+        </w:rPr>
+        <w:t xml:space="preserve">передає розмірність </w:t>
+      </w:r>
+      <w:r>
+        <w:rPr>
+          <w:lang w:val="en-US"/>
+        </w:rPr>
+        <w:t>DataFrame-</w:t>
+      </w:r>
+      <w:r>
+        <w:rPr>
+          <w:lang w:val="uk-UA"/>
+        </w:rPr>
+        <w:t>у.</w:t>
+      </w:r>
+    </w:p>
+    <w:p>
+      <w:pPr>
+        <w:pStyle w:val="P1"/>
+        <w:rPr>
+          <w:lang w:val="en-US"/>
+        </w:rPr>
+      </w:pPr>
+      <w:r>
+        <w:rPr>
+          <w:lang w:val="en-US"/>
+        </w:rPr>
+      </w:r>
+    </w:p>
+    <w:p>
+      <w:pPr>
+        <w:pStyle w:val="P1"/>
+        <w:rPr>
+          <w:lang w:val="uk-UA"/>
+        </w:rPr>
+      </w:pPr>
+      <w:r>
+        <w:rPr>
+          <w:lang w:val="uk-UA"/>
+        </w:rPr>
+        <w:t xml:space="preserve">Джерело: </w:t>
+      </w:r>
+      <w:hyperlink r:id="rId8">
+        <w:r>
+          <w:rPr>
+            <w:rStyle w:val="Hyperlink"/>
+            <w:lang w:val="uk-UA"/>
+          </w:rPr>
+          <w:t>https://www.geeksforgeeks.org/pandas/pandas-functions-in-python/</w:t>
+        </w:r>
+      </w:hyperlink>
+      <w:r>
+        <w:rPr>
+          <w:lang w:val="uk-UA"/>
+        </w:rPr>
+        <w:t>.</w:t>
       </w:r>
     </w:p>
     <w:p>
@@ -2174,6 +2328,143 @@
   <w:abstractNum w:abstractNumId="2">
     <w:lvl w:ilvl="0">
       <w:start w:val="1"/>
+      <w:numFmt w:val="bullet"/>
+      <w:lvlText w:val=""/>
+      <w:lvlJc w:val="left"/>
+      <w:pPr>
+        <w:tabs>
+          <w:tab w:val="num" w:pos="720"/>
+        </w:tabs>
+        <w:ind w:left="720" w:hanging="360"/>
+      </w:pPr>
+      <w:rPr>
+        <w:rFonts w:ascii="Symbol" w:hAnsi="Symbol" w:cs="Symbol" w:hint="default"/>
+      </w:rPr>
+    </w:lvl>
+    <w:lvl w:ilvl="1">
+      <w:start w:val="1"/>
+      <w:numFmt w:val="bullet"/>
+      <w:lvlText w:val="◦"/>
+      <w:lvlJc w:val="left"/>
+      <w:pPr>
+        <w:tabs>
+          <w:tab w:val="num" w:pos="1080"/>
+        </w:tabs>
+        <w:ind w:left="1080" w:hanging="360"/>
+      </w:pPr>
+      <w:rPr>
+        <w:rFonts w:ascii="OpenSymbol" w:hAnsi="OpenSymbol" w:cs="OpenSymbol" w:hint="default"/>
+      </w:rPr>
+    </w:lvl>
+    <w:lvl w:ilvl="2">
+      <w:start w:val="1"/>
+      <w:numFmt w:val="bullet"/>
+      <w:lvlText w:val="▪"/>
+      <w:lvlJc w:val="left"/>
+      <w:pPr>
+        <w:tabs>
+          <w:tab w:val="num" w:pos="1440"/>
+        </w:tabs>
+        <w:ind w:left="1440" w:hanging="360"/>
+      </w:pPr>
+      <w:rPr>
+        <w:rFonts w:ascii="OpenSymbol" w:hAnsi="OpenSymbol" w:cs="OpenSymbol" w:hint="default"/>
+      </w:rPr>
+    </w:lvl>
+    <w:lvl w:ilvl="3">
+      <w:start w:val="1"/>
+      <w:numFmt w:val="bullet"/>
+      <w:lvlText w:val=""/>
+      <w:lvlJc w:val="left"/>
+      <w:pPr>
+        <w:tabs>
+          <w:tab w:val="num" w:pos="1800"/>
+        </w:tabs>
+        <w:ind w:left="1800" w:hanging="360"/>
+      </w:pPr>
+      <w:rPr>
+        <w:rFonts w:ascii="Symbol" w:hAnsi="Symbol" w:cs="Symbol" w:hint="default"/>
+      </w:rPr>
+    </w:lvl>
+    <w:lvl w:ilvl="4">
+      <w:start w:val="1"/>
+      <w:numFmt w:val="bullet"/>
+      <w:lvlText w:val="◦"/>
+      <w:lvlJc w:val="left"/>
+      <w:pPr>
+        <w:tabs>
+          <w:tab w:val="num" w:pos="2160"/>
+        </w:tabs>
+        <w:ind w:left="2160" w:hanging="360"/>
+      </w:pPr>
+      <w:rPr>
+        <w:rFonts w:ascii="OpenSymbol" w:hAnsi="OpenSymbol" w:cs="OpenSymbol" w:hint="default"/>
+      </w:rPr>
+    </w:lvl>
+    <w:lvl w:ilvl="5">
+      <w:start w:val="1"/>
+      <w:numFmt w:val="bullet"/>
+      <w:lvlText w:val="▪"/>
+      <w:lvlJc w:val="left"/>
+      <w:pPr>
+        <w:tabs>
+          <w:tab w:val="num" w:pos="2520"/>
+        </w:tabs>
+        <w:ind w:left="2520" w:hanging="360"/>
+      </w:pPr>
+      <w:rPr>
+        <w:rFonts w:ascii="OpenSymbol" w:hAnsi="OpenSymbol" w:cs="OpenSymbol" w:hint="default"/>
+      </w:rPr>
+    </w:lvl>
+    <w:lvl w:ilvl="6">
+      <w:start w:val="1"/>
+      <w:numFmt w:val="bullet"/>
+      <w:lvlText w:val=""/>
+      <w:lvlJc w:val="left"/>
+      <w:pPr>
+        <w:tabs>
+          <w:tab w:val="num" w:pos="2880"/>
+        </w:tabs>
+        <w:ind w:left="2880" w:hanging="360"/>
+      </w:pPr>
+      <w:rPr>
+        <w:rFonts w:ascii="Symbol" w:hAnsi="Symbol" w:cs="Symbol" w:hint="default"/>
+      </w:rPr>
+    </w:lvl>
+    <w:lvl w:ilvl="7">
+      <w:start w:val="1"/>
+      <w:numFmt w:val="bullet"/>
+      <w:lvlText w:val="◦"/>
+      <w:lvlJc w:val="left"/>
+      <w:pPr>
+        <w:tabs>
+          <w:tab w:val="num" w:pos="3240"/>
+        </w:tabs>
+        <w:ind w:left="3240" w:hanging="360"/>
+      </w:pPr>
+      <w:rPr>
+        <w:rFonts w:ascii="OpenSymbol" w:hAnsi="OpenSymbol" w:cs="OpenSymbol" w:hint="default"/>
+      </w:rPr>
+    </w:lvl>
+    <w:lvl w:ilvl="8">
+      <w:start w:val="1"/>
+      <w:numFmt w:val="bullet"/>
+      <w:lvlText w:val="▪"/>
+      <w:lvlJc w:val="left"/>
+      <w:pPr>
+        <w:tabs>
+          <w:tab w:val="num" w:pos="3600"/>
+        </w:tabs>
+        <w:ind w:left="3600" w:hanging="360"/>
+      </w:pPr>
+      <w:rPr>
+        <w:rFonts w:ascii="OpenSymbol" w:hAnsi="OpenSymbol" w:cs="OpenSymbol" w:hint="default"/>
+      </w:rPr>
+    </w:lvl>
+  </w:abstractNum>
+  <w:abstractNum w:abstractNumId="3">
+    <w:lvl w:ilvl="0">
+      <w:start w:val="1"/>
       <w:numFmt w:val="none"/>
       <w:suff w:val="nothing"/>
       <w:lvlText w:val=""/>
@@ -2295,6 +2586,9 @@
   </w:num>
   <w:num w:numId="2">
     <w:abstractNumId w:val="2"/>
+  </w:num>
+  <w:num w:numId="3">
+    <w:abstractNumId w:val="3"/>
   </w:num>
 </w:numbering>
 </file>
@@ -3086,10 +3380,17 @@
       <w:lang w:val="en-US" w:eastAsia="uk-UA"/>
     </w:rPr>
   </w:style>
+  <w:style w:type="character" w:styleId="user">
+    <w:name w:val="Символ нумерації (user)"/>
+    <w:qFormat/>
+    <w:rPr/>
+  </w:style>
   <w:style w:type="character" w:styleId="Style12">
-    <w:name w:val="Символ нумерації"/>
-    <w:qFormat/>
-    <w:rPr/>
+    <w:name w:val="Маркери"/>
+    <w:qFormat/>
+    <w:rPr>
+      <w:rFonts w:ascii="OpenSymbol" w:hAnsi="OpenSymbol" w:eastAsia="OpenSymbol" w:cs="OpenSymbol"/>
+    </w:rPr>
   </w:style>
   <w:style w:type="paragraph" w:styleId="Style13">
     <w:name w:val="Заголовок"/>
@@ -3101,7 +3402,7 @@
       <w:spacing w:before="240" w:after="120"/>
     </w:pPr>
     <w:rPr>
-      <w:rFonts w:ascii="Liberation Sans" w:hAnsi="Liberation Sans" w:eastAsia="Microsoft YaHei" w:cs="Lucida Sans"/>
+      <w:rFonts w:ascii="Liberation Sans" w:hAnsi="Liberation Sans" w:eastAsia="Microsoft YaHei" w:cs="Arial Unicode MS"/>
       <w:sz w:val="28"/>
       <w:szCs w:val="28"/>
     </w:rPr>
@@ -3146,10 +3447,10 @@
       <w:suppressLineNumbers/>
     </w:pPr>
     <w:rPr>
-      <w:rFonts w:cs="Lucida Sans"/>
-    </w:rPr>
-  </w:style>
-  <w:style w:type="paragraph" w:styleId="user">
+      <w:rFonts w:cs="Arial Unicode MS"/>
+    </w:rPr>
+  </w:style>
+  <w:style w:type="paragraph" w:styleId="user1">
     <w:name w:val="Заголовок (user)"/>
     <w:basedOn w:val="Normal"/>
     <w:next w:val="BodyText"/>
@@ -3159,12 +3460,12 @@
       <w:spacing w:before="240" w:after="120"/>
     </w:pPr>
     <w:rPr>
-      <w:rFonts w:ascii="Liberation Sans" w:hAnsi="Liberation Sans" w:eastAsia="Microsoft YaHei" w:cs="Arial Unicode MS"/>
+      <w:rFonts w:ascii="Liberation Sans" w:hAnsi="Liberation Sans" w:eastAsia="Microsoft YaHei" w:cs="Lucida Sans"/>
       <w:sz w:val="28"/>
       <w:szCs w:val="28"/>
     </w:rPr>
   </w:style>
-  <w:style w:type="paragraph" w:styleId="user1">
+  <w:style w:type="paragraph" w:styleId="user2">
     <w:name w:val="Покажчик (user)"/>
     <w:basedOn w:val="Normal"/>
     <w:qFormat/>
@@ -3172,12 +3473,12 @@
       <w:suppressLineNumbers/>
     </w:pPr>
     <w:rPr>
-      <w:rFonts w:cs="Arial Unicode MS"/>
+      <w:rFonts w:cs="Lucida Sans"/>
     </w:rPr>
   </w:style>
   <w:style w:type="paragraph" w:styleId="IndexHeading">
     <w:name w:val="index heading"/>
-    <w:basedOn w:val="user"/>
+    <w:basedOn w:val="Style13"/>
     <w:pPr/>
     <w:rPr/>
   </w:style>
@@ -3482,8 +3783,8 @@
     </w:pPr>
     <w:rPr/>
   </w:style>
-  <w:style w:type="numbering" w:styleId="user2" w:default="1">
-    <w:name w:val="Без маркерів (user)"/>
+  <w:style w:type="numbering" w:styleId="Style15" w:default="1">
+    <w:name w:val="Без маркерів"/>
     <w:uiPriority w:val="99"/>
     <w:semiHidden/>
     <w:unhideWhenUsed/>

</xml_diff>

<commit_message>
IA2 done i thinkn
</commit_message>
<xml_diff>
--- a/41IA Intelektualnyj analiz danyh/2/BZ_KNT-122_Onyshchenko_19_PR2.docx
+++ b/41IA Intelektualnyj analiz danyh/2/BZ_KNT-122_Onyshchenko_19_PR2.docx
@@ -825,72 +825,44 @@
       </w:pPr>
       <w:r>
         <w:rPr/>
-        <w:t xml:space="preserve">Вибірку завантажено з репозиторію: </w:t>
-      </w:r>
-      <w:hyperlink r:id="rId2">
-        <w:r>
-          <w:rPr>
-            <w:rStyle w:val="Hyperlink"/>
-          </w:rPr>
-          <w:t>Weka/Weka datasets/breast-cancer.arff at master · tertiarycourses/Weka</w:t>
-        </w:r>
-      </w:hyperlink>
-      <w:r>
-        <w:rPr/>
-        <w:t>.</w:t>
-      </w:r>
-    </w:p>
-    <w:p>
-      <w:pPr>
-        <w:pStyle w:val="p11"/>
-        <w:rPr/>
-      </w:pPr>
-      <w:r>
-        <w:rPr/>
-        <w:t xml:space="preserve">Вибірку конвертовано до </w:t>
+        <w:t xml:space="preserve">Вибірку завантажено через кнопку </w:t>
       </w:r>
       <w:r>
         <w:rPr>
           <w:lang w:val="en-US"/>
         </w:rPr>
-        <w:t xml:space="preserve">CSV </w:t>
+        <w:t xml:space="preserve">Open file. </w:t>
       </w:r>
       <w:r>
         <w:rPr>
           <w:lang w:val="uk-UA"/>
         </w:rPr>
-        <w:t xml:space="preserve">вручну, використовуючи інструменти </w:t>
-      </w:r>
-      <w:r>
-        <w:rPr>
-          <w:lang w:val="en-US"/>
-        </w:rPr>
-        <w:t>VS Code:</w:t>
-      </w:r>
-    </w:p>
-    <w:p>
-      <w:pPr>
-        <w:pStyle w:val="p11"/>
-        <w:rPr>
-          <w:lang w:val="en-US"/>
-        </w:rPr>
-      </w:pPr>
-      <w:r>
-        <w:rPr>
-          <w:lang w:val="en-US"/>
-        </w:rPr>
-      </w:r>
-    </w:p>
-    <w:p>
-      <w:pPr>
-        <w:pStyle w:val="IMG1"/>
+        <w:t>Описано на рисунку нижче:</w:t>
+      </w:r>
+    </w:p>
+    <w:p>
+      <w:pPr>
+        <w:pStyle w:val="p11"/>
+        <w:rPr>
+          <w:lang w:val="uk-UA"/>
+        </w:rPr>
+      </w:pPr>
+      <w:r>
+        <w:rPr>
+          <w:lang w:val="uk-UA"/>
+        </w:rPr>
+      </w:r>
+    </w:p>
+    <w:p>
+      <w:pPr>
+        <w:pStyle w:val="img11"/>
         <w:rPr/>
       </w:pPr>
       <w:r>
         <w:rPr/>
         <w:drawing>
           <wp:inline distT="0" distB="0" distL="0" distR="0">
-            <wp:extent cx="5731510" cy="2595880"/>
+            <wp:extent cx="5731510" cy="6161405"/>
             <wp:effectExtent l="0" t="0" r="0" b="0"/>
             <wp:docPr id="1" name="Зображення1"/>
             <wp:cNvGraphicFramePr>
@@ -906,7 +878,7 @@
                     </pic:cNvPicPr>
                   </pic:nvPicPr>
                   <pic:blipFill>
-                    <a:blip r:embed="rId3"/>
+                    <a:blip r:embed="rId2"/>
                     <a:stretch>
                       <a:fillRect/>
                     </a:stretch>
@@ -914,7 +886,7 @@
                   <pic:spPr bwMode="auto">
                     <a:xfrm>
                       <a:off x="0" y="0"/>
-                      <a:ext cx="5731510" cy="2595880"/>
+                      <a:ext cx="5731510" cy="6161405"/>
                     </a:xfrm>
                     <a:prstGeom prst="rect">
                       <a:avLst/>
@@ -930,52 +902,52 @@
     </w:p>
     <w:p>
       <w:pPr>
+        <w:pStyle w:val="img11"/>
+        <w:rPr/>
+      </w:pPr>
+      <w:r>
+        <w:rPr/>
+        <w:t>Рисунок 1.1 — Завантажена вибірка</w:t>
+      </w:r>
+    </w:p>
+    <w:p>
+      <w:pPr>
+        <w:pStyle w:val="img11"/>
+        <w:rPr/>
+      </w:pPr>
+      <w:r>
+        <w:rPr/>
+      </w:r>
+    </w:p>
+    <w:p>
+      <w:pPr>
+        <w:pStyle w:val="p11"/>
+        <w:rPr/>
+      </w:pPr>
+      <w:r>
+        <w:rPr/>
+        <w:t>Далі описано атрибути вибірки. Наведено на рисунку нижче:</w:t>
+      </w:r>
+    </w:p>
+    <w:p>
+      <w:pPr>
+        <w:pStyle w:val="p11"/>
+        <w:rPr/>
+      </w:pPr>
+      <w:r>
+        <w:rPr/>
+      </w:r>
+    </w:p>
+    <w:p>
+      <w:pPr>
         <w:pStyle w:val="IMG1"/>
-        <w:rPr/>
-      </w:pPr>
-      <w:r>
-        <w:rPr/>
-        <w:t>Рисунок 1.1 — Вибірка у форматі таблиці</w:t>
-      </w:r>
-    </w:p>
-    <w:p>
-      <w:pPr>
-        <w:pStyle w:val="IMG1"/>
-        <w:rPr/>
-      </w:pPr>
-      <w:r>
-        <w:rPr/>
-      </w:r>
-    </w:p>
-    <w:p>
-      <w:pPr>
-        <w:pStyle w:val="P1"/>
-        <w:rPr/>
-      </w:pPr>
-      <w:r>
-        <w:rPr/>
-        <w:t>Після запуску коду отримано такі графіки:</w:t>
-      </w:r>
-    </w:p>
-    <w:p>
-      <w:pPr>
-        <w:pStyle w:val="img11"/>
-        <w:rPr/>
-      </w:pPr>
-      <w:r>
-        <w:rPr/>
-      </w:r>
-    </w:p>
-    <w:p>
-      <w:pPr>
-        <w:pStyle w:val="img11"/>
         <w:rPr/>
       </w:pPr>
       <w:r>
         <w:rPr/>
         <w:drawing>
           <wp:inline distT="0" distB="0" distL="0" distR="0">
-            <wp:extent cx="4582795" cy="3436620"/>
+            <wp:extent cx="5731510" cy="6161405"/>
             <wp:effectExtent l="0" t="0" r="0" b="0"/>
             <wp:docPr id="2" name="Зображення2"/>
             <wp:cNvGraphicFramePr>
@@ -991,7 +963,7 @@
                     </pic:cNvPicPr>
                   </pic:nvPicPr>
                   <pic:blipFill>
-                    <a:blip r:embed="rId4"/>
+                    <a:blip r:embed="rId3"/>
                     <a:stretch>
                       <a:fillRect/>
                     </a:stretch>
@@ -999,7 +971,7 @@
                   <pic:spPr bwMode="auto">
                     <a:xfrm>
                       <a:off x="0" y="0"/>
-                      <a:ext cx="4582795" cy="3436620"/>
+                      <a:ext cx="5731510" cy="6161405"/>
                     </a:xfrm>
                     <a:prstGeom prst="rect">
                       <a:avLst/>
@@ -1015,39 +987,72 @@
     </w:p>
     <w:p>
       <w:pPr>
-        <w:pStyle w:val="img11"/>
-        <w:rPr/>
-      </w:pPr>
-      <w:r>
-        <w:rPr/>
-        <w:t xml:space="preserve">Рисунок 1.2 — Графік </w:t>
+        <w:pStyle w:val="IMG1"/>
+        <w:rPr/>
+      </w:pPr>
+      <w:r>
+        <w:rPr/>
+        <w:t>Рисунок 1.2 — Описані атрибути вибірки</w:t>
+      </w:r>
+    </w:p>
+    <w:p>
+      <w:pPr>
+        <w:pStyle w:val="IMG1"/>
+        <w:rPr/>
+      </w:pPr>
+      <w:r>
+        <w:rPr/>
+      </w:r>
+    </w:p>
+    <w:p>
+      <w:pPr>
+        <w:pStyle w:val="p11"/>
+        <w:rPr>
+          <w:lang w:val="uk-UA"/>
+        </w:rPr>
+      </w:pPr>
+      <w:r>
+        <w:rPr>
+          <w:lang w:val="uk-UA"/>
+        </w:rPr>
+        <w:t xml:space="preserve">Типи дані визначені на вкладці </w:t>
       </w:r>
       <w:r>
         <w:rPr>
           <w:lang w:val="en-US"/>
         </w:rPr>
-        <w:t>bar</w:t>
-      </w:r>
-    </w:p>
-    <w:p>
-      <w:pPr>
-        <w:pStyle w:val="img11"/>
-        <w:rPr/>
-      </w:pPr>
-      <w:r>
-        <w:rPr/>
-      </w:r>
-    </w:p>
-    <w:p>
-      <w:pPr>
-        <w:pStyle w:val="img11"/>
+        <w:t xml:space="preserve">Preprocess. </w:t>
+      </w:r>
+      <w:r>
+        <w:rPr>
+          <w:lang w:val="uk-UA"/>
+        </w:rPr>
+        <w:t>Деталі на картинці нижче:</w:t>
+      </w:r>
+    </w:p>
+    <w:p>
+      <w:pPr>
+        <w:pStyle w:val="p11"/>
+        <w:rPr>
+          <w:lang w:val="uk-UA"/>
+        </w:rPr>
+      </w:pPr>
+      <w:r>
+        <w:rPr>
+          <w:lang w:val="uk-UA"/>
+        </w:rPr>
+      </w:r>
+    </w:p>
+    <w:p>
+      <w:pPr>
+        <w:pStyle w:val="IMG1"/>
         <w:rPr/>
       </w:pPr>
       <w:r>
         <w:rPr/>
         <w:drawing>
           <wp:inline distT="0" distB="0" distL="0" distR="0">
-            <wp:extent cx="4596765" cy="3447415"/>
+            <wp:extent cx="5731510" cy="6161405"/>
             <wp:effectExtent l="0" t="0" r="0" b="0"/>
             <wp:docPr id="3" name="Зображення3"/>
             <wp:cNvGraphicFramePr>
@@ -1063,7 +1068,7 @@
                     </pic:cNvPicPr>
                   </pic:nvPicPr>
                   <pic:blipFill>
-                    <a:blip r:embed="rId5"/>
+                    <a:blip r:embed="rId4"/>
                     <a:stretch>
                       <a:fillRect/>
                     </a:stretch>
@@ -1071,7 +1076,7 @@
                   <pic:spPr bwMode="auto">
                     <a:xfrm>
                       <a:off x="0" y="0"/>
-                      <a:ext cx="4596765" cy="3447415"/>
+                      <a:ext cx="5731510" cy="6161405"/>
                     </a:xfrm>
                     <a:prstGeom prst="rect">
                       <a:avLst/>
@@ -1087,39 +1092,84 @@
     </w:p>
     <w:p>
       <w:pPr>
-        <w:pStyle w:val="img11"/>
-        <w:rPr/>
-      </w:pPr>
-      <w:r>
-        <w:rPr/>
-        <w:t xml:space="preserve">Рисунок 1.3 — Графік </w:t>
+        <w:pStyle w:val="IMG1"/>
+        <w:rPr/>
+      </w:pPr>
+      <w:r>
+        <w:rPr/>
+        <w:t>Рисунок 1.3 — Типи даних</w:t>
+      </w:r>
+    </w:p>
+    <w:p>
+      <w:pPr>
+        <w:pStyle w:val="p11"/>
+        <w:rPr>
+          <w:lang w:val="uk-UA"/>
+        </w:rPr>
+      </w:pPr>
+      <w:r>
+        <w:rPr>
+          <w:lang w:val="uk-UA"/>
+        </w:rPr>
+      </w:r>
+    </w:p>
+    <w:p>
+      <w:pPr>
+        <w:pStyle w:val="p11"/>
+        <w:rPr>
+          <w:lang w:val="uk-UA"/>
+        </w:rPr>
+      </w:pPr>
+      <w:r>
+        <w:rPr>
+          <w:lang w:val="uk-UA"/>
+        </w:rPr>
+        <w:t xml:space="preserve">Цільовим атрибутом є </w:t>
       </w:r>
       <w:r>
         <w:rPr>
           <w:lang w:val="en-US"/>
         </w:rPr>
-        <w:t>hist</w:t>
-      </w:r>
-    </w:p>
-    <w:p>
-      <w:pPr>
-        <w:pStyle w:val="img11"/>
-        <w:rPr/>
-      </w:pPr>
-      <w:r>
-        <w:rPr/>
-      </w:r>
-    </w:p>
-    <w:p>
-      <w:pPr>
-        <w:pStyle w:val="img11"/>
+        <w:t xml:space="preserve">class. </w:t>
+      </w:r>
+      <w:r>
+        <w:rPr>
+          <w:lang w:val="uk-UA"/>
+        </w:rPr>
+        <w:t xml:space="preserve">Він приймає значення </w:t>
+      </w:r>
+      <w:r>
+        <w:rPr>
+          <w:lang w:val="en-US"/>
+        </w:rPr>
+        <w:t xml:space="preserve">iris-setosa, iris-versicolor, iris-virginica. </w:t>
+      </w:r>
+      <w:r>
+        <w:rPr>
+          <w:lang w:val="uk-UA"/>
+        </w:rPr>
+        <w:t>Класи рівно розподілені по 50 штук на кожен клас. Деталі на картинці нижче:</w:t>
+      </w:r>
+    </w:p>
+    <w:p>
+      <w:pPr>
+        <w:pStyle w:val="IMG1"/>
+        <w:rPr/>
+      </w:pPr>
+      <w:r>
+        <w:rPr/>
+      </w:r>
+    </w:p>
+    <w:p>
+      <w:pPr>
+        <w:pStyle w:val="IMG1"/>
         <w:rPr/>
       </w:pPr>
       <w:r>
         <w:rPr/>
         <w:drawing>
           <wp:inline distT="0" distB="0" distL="0" distR="0">
-            <wp:extent cx="5581015" cy="4185920"/>
+            <wp:extent cx="5731510" cy="6161405"/>
             <wp:effectExtent l="0" t="0" r="0" b="0"/>
             <wp:docPr id="4" name="Зображення4"/>
             <wp:cNvGraphicFramePr>
@@ -1135,7 +1185,7 @@
                     </pic:cNvPicPr>
                   </pic:nvPicPr>
                   <pic:blipFill>
-                    <a:blip r:embed="rId6"/>
+                    <a:blip r:embed="rId5"/>
                     <a:stretch>
                       <a:fillRect/>
                     </a:stretch>
@@ -1143,7 +1193,7 @@
                   <pic:spPr bwMode="auto">
                     <a:xfrm>
                       <a:off x="0" y="0"/>
-                      <a:ext cx="5581015" cy="4185920"/>
+                      <a:ext cx="5731510" cy="6161405"/>
                     </a:xfrm>
                     <a:prstGeom prst="rect">
                       <a:avLst/>
@@ -1159,39 +1209,66 @@
     </w:p>
     <w:p>
       <w:pPr>
-        <w:pStyle w:val="img11"/>
-        <w:rPr/>
-      </w:pPr>
-      <w:r>
-        <w:rPr/>
-        <w:t xml:space="preserve">Рисунок 1.4 — Графік </w:t>
+        <w:pStyle w:val="IMG1"/>
+        <w:rPr/>
+      </w:pPr>
+      <w:r>
+        <w:rPr/>
+        <w:t>Рисунок 1.4 — Розподіл класів</w:t>
+      </w:r>
+    </w:p>
+    <w:p>
+      <w:pPr>
+        <w:pStyle w:val="p11"/>
+        <w:rPr>
+          <w:lang w:val="uk-UA"/>
+        </w:rPr>
+      </w:pPr>
+      <w:r>
+        <w:rPr>
+          <w:lang w:val="uk-UA"/>
+        </w:rPr>
+      </w:r>
+    </w:p>
+    <w:p>
+      <w:pPr>
+        <w:pStyle w:val="p11"/>
+        <w:rPr>
+          <w:lang w:val="uk-UA"/>
+        </w:rPr>
+      </w:pPr>
+      <w:r>
+        <w:rPr>
+          <w:lang w:val="uk-UA"/>
+        </w:rPr>
+        <w:t xml:space="preserve">Графічно дані можна подати на вкладці </w:t>
       </w:r>
       <w:r>
         <w:rPr>
           <w:lang w:val="en-US"/>
         </w:rPr>
-        <w:t>pie</w:t>
-      </w:r>
-    </w:p>
-    <w:p>
-      <w:pPr>
-        <w:pStyle w:val="img11"/>
-        <w:rPr/>
-      </w:pPr>
-      <w:r>
-        <w:rPr/>
-      </w:r>
-    </w:p>
-    <w:p>
-      <w:pPr>
-        <w:pStyle w:val="img11"/>
+        <w:t>Visualize:</w:t>
+      </w:r>
+    </w:p>
+    <w:p>
+      <w:pPr>
+        <w:pStyle w:val="IMG1"/>
+        <w:rPr/>
+      </w:pPr>
+      <w:r>
+        <w:rPr/>
+      </w:r>
+    </w:p>
+    <w:p>
+      <w:pPr>
+        <w:pStyle w:val="IMG1"/>
         <w:rPr/>
       </w:pPr>
       <w:r>
         <w:rPr/>
         <w:drawing>
           <wp:inline distT="0" distB="0" distL="0" distR="0">
-            <wp:extent cx="4391025" cy="3293110"/>
+            <wp:extent cx="5731510" cy="6161405"/>
             <wp:effectExtent l="0" t="0" r="0" b="0"/>
             <wp:docPr id="5" name="Зображення5"/>
             <wp:cNvGraphicFramePr>
@@ -1207,7 +1284,7 @@
                     </pic:cNvPicPr>
                   </pic:nvPicPr>
                   <pic:blipFill>
-                    <a:blip r:embed="rId7"/>
+                    <a:blip r:embed="rId6"/>
                     <a:stretch>
                       <a:fillRect/>
                     </a:stretch>
@@ -1215,7 +1292,7 @@
                   <pic:spPr bwMode="auto">
                     <a:xfrm>
                       <a:off x="0" y="0"/>
-                      <a:ext cx="4391025" cy="3293110"/>
+                      <a:ext cx="5731510" cy="6161405"/>
                     </a:xfrm>
                     <a:prstGeom prst="rect">
                       <a:avLst/>
@@ -1231,27 +1308,35 @@
     </w:p>
     <w:p>
       <w:pPr>
-        <w:pStyle w:val="img11"/>
-        <w:rPr/>
-      </w:pPr>
-      <w:r>
-        <w:rPr/>
-        <w:t xml:space="preserve">Рисунок 1.5 — Графік </w:t>
-      </w:r>
-      <w:r>
-        <w:rPr>
-          <w:lang w:val="en-US"/>
-        </w:rPr>
-        <w:t>hist</w:t>
-      </w:r>
-    </w:p>
-    <w:p>
-      <w:pPr>
-        <w:pStyle w:val="p11"/>
-        <w:rPr/>
-      </w:pPr>
-      <w:r>
-        <w:rPr/>
+        <w:pStyle w:val="IMG1"/>
+        <w:rPr/>
+      </w:pPr>
+      <w:r>
+        <w:rPr/>
+        <w:t>Рисунок 1.5 — Графічно подані дані</w:t>
+      </w:r>
+    </w:p>
+    <w:p>
+      <w:pPr>
+        <w:pStyle w:val="p11"/>
+        <w:rPr>
+          <w:lang w:val="uk-UA"/>
+        </w:rPr>
+      </w:pPr>
+      <w:r>
+        <w:rPr>
+          <w:lang w:val="uk-UA"/>
+        </w:rPr>
+      </w:r>
+    </w:p>
+    <w:p>
+      <w:pPr>
+        <w:pStyle w:val="h11"/>
+        <w:rPr/>
+      </w:pPr>
+      <w:r>
+        <w:rPr/>
+        <w:t>Питання</w:t>
       </w:r>
     </w:p>
     <w:p>
@@ -1261,477 +1346,7 @@
       </w:pPr>
       <w:r>
         <w:rPr/>
-        <w:t>Код</w:t>
-      </w:r>
-    </w:p>
-    <w:p>
-      <w:pPr>
-        <w:pStyle w:val="Code"/>
-        <w:rPr>
-          <w:color w:val="auto"/>
-        </w:rPr>
-      </w:pPr>
-      <w:r>
-        <w:rPr>
-          <w:color w:val="auto"/>
-        </w:rPr>
-      </w:r>
-    </w:p>
-    <w:p>
-      <w:pPr>
-        <w:pStyle w:val="Code"/>
-        <w:rPr>
-          <w:color w:val="auto"/>
-        </w:rPr>
-      </w:pPr>
-      <w:r>
-        <w:rPr>
-          <w:color w:val="auto"/>
-        </w:rPr>
-        <w:t>import os</w:t>
-      </w:r>
-    </w:p>
-    <w:p>
-      <w:pPr>
-        <w:pStyle w:val="Code"/>
-        <w:rPr>
-          <w:color w:val="auto"/>
-        </w:rPr>
-      </w:pPr>
-      <w:r>
-        <w:rPr>
-          <w:color w:val="auto"/>
-        </w:rPr>
-        <w:t>import pandas as pd</w:t>
-      </w:r>
-    </w:p>
-    <w:p>
-      <w:pPr>
-        <w:pStyle w:val="Code"/>
-        <w:rPr>
-          <w:color w:val="auto"/>
-        </w:rPr>
-      </w:pPr>
-      <w:r>
-        <w:rPr>
-          <w:color w:val="auto"/>
-        </w:rPr>
-        <w:t>from matplotlib import pyplot as plt</w:t>
-      </w:r>
-    </w:p>
-    <w:p>
-      <w:pPr>
-        <w:pStyle w:val="Code"/>
-        <w:rPr>
-          <w:color w:val="auto"/>
-        </w:rPr>
-      </w:pPr>
-      <w:r>
-        <w:rPr>
-          <w:color w:val="auto"/>
-        </w:rPr>
-      </w:r>
-    </w:p>
-    <w:p>
-      <w:pPr>
-        <w:pStyle w:val="Code"/>
-        <w:rPr>
-          <w:color w:val="auto"/>
-        </w:rPr>
-      </w:pPr>
-      <w:r>
-        <w:rPr>
-          <w:color w:val="auto"/>
-        </w:rPr>
-        <w:t># Load data</w:t>
-      </w:r>
-    </w:p>
-    <w:p>
-      <w:pPr>
-        <w:pStyle w:val="Code"/>
-        <w:rPr>
-          <w:color w:val="auto"/>
-        </w:rPr>
-      </w:pPr>
-      <w:r>
-        <w:rPr>
-          <w:color w:val="auto"/>
-        </w:rPr>
-        <w:t>root_folder = os.path.dirname(os.path.abspath(__file__))</w:t>
-      </w:r>
-    </w:p>
-    <w:p>
-      <w:pPr>
-        <w:pStyle w:val="Code"/>
-        <w:rPr>
-          <w:color w:val="auto"/>
-        </w:rPr>
-      </w:pPr>
-      <w:r>
-        <w:rPr>
-          <w:color w:val="auto"/>
-        </w:rPr>
-        <w:t>file_name = "breast-cancer.csv"</w:t>
-      </w:r>
-    </w:p>
-    <w:p>
-      <w:pPr>
-        <w:pStyle w:val="Code"/>
-        <w:rPr>
-          <w:color w:val="auto"/>
-        </w:rPr>
-      </w:pPr>
-      <w:r>
-        <w:rPr>
-          <w:color w:val="auto"/>
-        </w:rPr>
-        <w:t>file_path = os.path.join(root_folder, "data", file_name)</w:t>
-      </w:r>
-    </w:p>
-    <w:p>
-      <w:pPr>
-        <w:pStyle w:val="Code"/>
-        <w:rPr>
-          <w:color w:val="auto"/>
-        </w:rPr>
-      </w:pPr>
-      <w:r>
-        <w:rPr>
-          <w:color w:val="auto"/>
-        </w:rPr>
-      </w:r>
-    </w:p>
-    <w:p>
-      <w:pPr>
-        <w:pStyle w:val="Code"/>
-        <w:rPr>
-          <w:color w:val="auto"/>
-        </w:rPr>
-      </w:pPr>
-      <w:r>
-        <w:rPr>
-          <w:color w:val="auto"/>
-        </w:rPr>
-        <w:t># Print table</w:t>
-      </w:r>
-    </w:p>
-    <w:p>
-      <w:pPr>
-        <w:pStyle w:val="Code"/>
-        <w:rPr>
-          <w:color w:val="auto"/>
-        </w:rPr>
-      </w:pPr>
-      <w:r>
-        <w:rPr>
-          <w:color w:val="auto"/>
-        </w:rPr>
-        <w:t>data = pd.read_csv(file_path, na_values=["?"])</w:t>
-      </w:r>
-    </w:p>
-    <w:p>
-      <w:pPr>
-        <w:pStyle w:val="Code"/>
-        <w:rPr>
-          <w:color w:val="auto"/>
-        </w:rPr>
-      </w:pPr>
-      <w:r>
-        <w:rPr>
-          <w:color w:val="auto"/>
-        </w:rPr>
-        <w:t>print(data.head())</w:t>
-      </w:r>
-    </w:p>
-    <w:p>
-      <w:pPr>
-        <w:pStyle w:val="Code"/>
-        <w:rPr>
-          <w:color w:val="auto"/>
-        </w:rPr>
-      </w:pPr>
-      <w:r>
-        <w:rPr>
-          <w:color w:val="auto"/>
-        </w:rPr>
-        <w:t>print()</w:t>
-      </w:r>
-    </w:p>
-    <w:p>
-      <w:pPr>
-        <w:pStyle w:val="Code"/>
-        <w:rPr>
-          <w:color w:val="auto"/>
-        </w:rPr>
-      </w:pPr>
-      <w:r>
-        <w:rPr>
-          <w:color w:val="auto"/>
-        </w:rPr>
-      </w:r>
-    </w:p>
-    <w:p>
-      <w:pPr>
-        <w:pStyle w:val="Code"/>
-        <w:rPr>
-          <w:color w:val="auto"/>
-        </w:rPr>
-      </w:pPr>
-      <w:r>
-        <w:rPr>
-          <w:color w:val="auto"/>
-        </w:rPr>
-        <w:t># Fill missing values</w:t>
-      </w:r>
-    </w:p>
-    <w:p>
-      <w:pPr>
-        <w:pStyle w:val="Code"/>
-        <w:rPr>
-          <w:color w:val="auto"/>
-        </w:rPr>
-      </w:pPr>
-      <w:r>
-        <w:rPr>
-          <w:color w:val="auto"/>
-        </w:rPr>
-        <w:t>data["node-caps"] = data["node-caps"].fillna(data["node-caps"].mode())</w:t>
-      </w:r>
-    </w:p>
-    <w:p>
-      <w:pPr>
-        <w:pStyle w:val="Code"/>
-        <w:rPr>
-          <w:color w:val="auto"/>
-        </w:rPr>
-      </w:pPr>
-      <w:r>
-        <w:rPr>
-          <w:color w:val="auto"/>
-        </w:rPr>
-        <w:t>print(data.head())</w:t>
-      </w:r>
-    </w:p>
-    <w:p>
-      <w:pPr>
-        <w:pStyle w:val="Code"/>
-        <w:rPr>
-          <w:color w:val="auto"/>
-        </w:rPr>
-      </w:pPr>
-      <w:r>
-        <w:rPr>
-          <w:color w:val="auto"/>
-        </w:rPr>
-      </w:r>
-    </w:p>
-    <w:p>
-      <w:pPr>
-        <w:pStyle w:val="Code"/>
-        <w:rPr>
-          <w:color w:val="auto"/>
-        </w:rPr>
-      </w:pPr>
-      <w:r>
-        <w:rPr>
-          <w:color w:val="auto"/>
-        </w:rPr>
-        <w:t># Replace categorical with numbers</w:t>
-      </w:r>
-    </w:p>
-    <w:p>
-      <w:pPr>
-        <w:pStyle w:val="Code"/>
-        <w:rPr>
-          <w:color w:val="auto"/>
-        </w:rPr>
-      </w:pPr>
-      <w:r>
-        <w:rPr>
-          <w:color w:val="auto"/>
-        </w:rPr>
-        <w:t>data["node-caps"].replace({"yes": 1, "no": 0}, inplace=True)</w:t>
-      </w:r>
-    </w:p>
-    <w:p>
-      <w:pPr>
-        <w:pStyle w:val="Code"/>
-        <w:rPr>
-          <w:color w:val="auto"/>
-        </w:rPr>
-      </w:pPr>
-      <w:r>
-        <w:rPr>
-          <w:color w:val="auto"/>
-        </w:rPr>
-        <w:t>data["breast"].replace({"left": 1, "right": 0}, inplace=True)</w:t>
-      </w:r>
-    </w:p>
-    <w:p>
-      <w:pPr>
-        <w:pStyle w:val="Code"/>
-        <w:rPr>
-          <w:color w:val="auto"/>
-        </w:rPr>
-      </w:pPr>
-      <w:r>
-        <w:rPr>
-          <w:color w:val="auto"/>
-        </w:rPr>
-        <w:t>data["irradiat"].replace({"yes": 1, "no": 0}, inplace=True)</w:t>
-      </w:r>
-    </w:p>
-    <w:p>
-      <w:pPr>
-        <w:pStyle w:val="Code"/>
-        <w:rPr>
-          <w:color w:val="auto"/>
-        </w:rPr>
-      </w:pPr>
-      <w:r>
-        <w:rPr>
-          <w:color w:val="auto"/>
-        </w:rPr>
-        <w:t>print(data.head())</w:t>
-      </w:r>
-    </w:p>
-    <w:p>
-      <w:pPr>
-        <w:pStyle w:val="Code"/>
-        <w:rPr>
-          <w:color w:val="auto"/>
-        </w:rPr>
-      </w:pPr>
-      <w:r>
-        <w:rPr>
-          <w:color w:val="auto"/>
-        </w:rPr>
-      </w:r>
-    </w:p>
-    <w:p>
-      <w:pPr>
-        <w:pStyle w:val="Code"/>
-        <w:rPr>
-          <w:color w:val="auto"/>
-        </w:rPr>
-      </w:pPr>
-      <w:r>
-        <w:rPr>
-          <w:color w:val="auto"/>
-        </w:rPr>
-        <w:t># Pie</w:t>
-      </w:r>
-    </w:p>
-    <w:p>
-      <w:pPr>
-        <w:pStyle w:val="Code"/>
-        <w:rPr>
-          <w:color w:val="auto"/>
-        </w:rPr>
-      </w:pPr>
-      <w:r>
-        <w:rPr>
-          <w:color w:val="auto"/>
-        </w:rPr>
-        <w:t>data.head().plot(kind="pie", y="deg-malig")</w:t>
-      </w:r>
-    </w:p>
-    <w:p>
-      <w:pPr>
-        <w:pStyle w:val="Code"/>
-        <w:rPr>
-          <w:color w:val="auto"/>
-        </w:rPr>
-      </w:pPr>
-      <w:r>
-        <w:rPr>
-          <w:color w:val="auto"/>
-        </w:rPr>
-        <w:t># Hist</w:t>
-      </w:r>
-    </w:p>
-    <w:p>
-      <w:pPr>
-        <w:pStyle w:val="Code"/>
-        <w:rPr>
-          <w:color w:val="auto"/>
-        </w:rPr>
-      </w:pPr>
-      <w:r>
-        <w:rPr>
-          <w:color w:val="auto"/>
-        </w:rPr>
-        <w:t>data.hist(column="deg-malig")</w:t>
-      </w:r>
-    </w:p>
-    <w:p>
-      <w:pPr>
-        <w:pStyle w:val="Code"/>
-        <w:rPr>
-          <w:color w:val="auto"/>
-        </w:rPr>
-      </w:pPr>
-      <w:r>
-        <w:rPr>
-          <w:color w:val="auto"/>
-        </w:rPr>
-        <w:t># Scatter</w:t>
-      </w:r>
-    </w:p>
-    <w:p>
-      <w:pPr>
-        <w:pStyle w:val="Code"/>
-        <w:rPr>
-          <w:color w:val="auto"/>
-        </w:rPr>
-      </w:pPr>
-      <w:r>
-        <w:rPr>
-          <w:color w:val="auto"/>
-        </w:rPr>
-        <w:t>data.plot(kind="scatter", x="age", y="tumor-size")</w:t>
-      </w:r>
-    </w:p>
-    <w:p>
-      <w:pPr>
-        <w:pStyle w:val="Code"/>
-        <w:rPr>
-          <w:color w:val="auto"/>
-        </w:rPr>
-      </w:pPr>
-      <w:r>
-        <w:rPr>
-          <w:color w:val="auto"/>
-        </w:rPr>
-        <w:t># Bar</w:t>
-      </w:r>
-    </w:p>
-    <w:p>
-      <w:pPr>
-        <w:pStyle w:val="Code"/>
-        <w:rPr>
-          <w:color w:val="auto"/>
-        </w:rPr>
-      </w:pPr>
-      <w:r>
-        <w:rPr>
-          <w:color w:val="auto"/>
-        </w:rPr>
-        <w:t>data.head().plot(kind="bar", y="deg-malig")</w:t>
-      </w:r>
-    </w:p>
-    <w:p>
-      <w:pPr>
-        <w:pStyle w:val="Code"/>
-        <w:rPr>
-          <w:color w:val="auto"/>
-        </w:rPr>
-      </w:pPr>
-      <w:r>
-        <w:rPr>
-          <w:color w:val="auto"/>
-        </w:rPr>
-        <w:t>plt.show()</w:t>
+        <w:t xml:space="preserve">Що таке якість даних? Яка мета підготовки даних до аналізу? </w:t>
       </w:r>
     </w:p>
     <w:p>
@@ -1745,12 +1360,31 @@
     </w:p>
     <w:p>
       <w:pPr>
-        <w:pStyle w:val="h11"/>
-        <w:rPr/>
-      </w:pPr>
-      <w:r>
-        <w:rPr/>
-        <w:t>Питання</w:t>
+        <w:pStyle w:val="P1"/>
+        <w:rPr/>
+      </w:pPr>
+      <w:r>
+        <w:rPr/>
+        <w:t>Якість даних це те, наскільки корисними вони є при застосуванні.</w:t>
+      </w:r>
+    </w:p>
+    <w:p>
+      <w:pPr>
+        <w:pStyle w:val="P1"/>
+        <w:rPr/>
+      </w:pPr>
+      <w:r>
+        <w:rPr/>
+        <w:t>Метою підготовки даних до аналізу є форматування їх для зручнішої роботи.</w:t>
+      </w:r>
+    </w:p>
+    <w:p>
+      <w:pPr>
+        <w:pStyle w:val="P1"/>
+        <w:rPr/>
+      </w:pPr>
+      <w:r>
+        <w:rPr/>
       </w:r>
     </w:p>
     <w:p>
@@ -1760,7 +1394,7 @@
       </w:pPr>
       <w:r>
         <w:rPr/>
-        <w:t xml:space="preserve">Що таке якість даних? Яка мета підготовки даних до аналізу? </w:t>
+        <w:t xml:space="preserve">Що таке атрибут та екземпляр вибірки? </w:t>
       </w:r>
     </w:p>
     <w:p>
@@ -1779,7 +1413,7 @@
       </w:pPr>
       <w:r>
         <w:rPr/>
-        <w:t>Якість даних це те, наскільки корисними вони є при застосуванні.</w:t>
+        <w:t>Атрибут це властивість даних.</w:t>
       </w:r>
     </w:p>
     <w:p>
@@ -1789,7 +1423,7 @@
       </w:pPr>
       <w:r>
         <w:rPr/>
-        <w:t>Метою підготовки даних до аналізу є форматування їх для зручнішої роботи.</w:t>
+        <w:t>Екземпляр це окремий елемент вибірки.</w:t>
       </w:r>
     </w:p>
     <w:p>
@@ -1808,7 +1442,7 @@
       </w:pPr>
       <w:r>
         <w:rPr/>
-        <w:t xml:space="preserve">Що таке атрибут та екземпляр вибірки? </w:t>
+        <w:t xml:space="preserve">Який атрибут даних називають цільовим? Що таке значимий та незначимий атрибут? </w:t>
       </w:r>
     </w:p>
     <w:p>
@@ -1827,7 +1461,7 @@
       </w:pPr>
       <w:r>
         <w:rPr/>
-        <w:t>Атрибут це властивість даних.</w:t>
+        <w:t>Цільовим називають такий атрибут, який складно виміряти.</w:t>
       </w:r>
     </w:p>
     <w:p>
@@ -1837,7 +1471,7 @@
       </w:pPr>
       <w:r>
         <w:rPr/>
-        <w:t>Екземпляр це окремий елемент вибірки.</w:t>
+        <w:t>Значимий це такий атрибут, який корисний.</w:t>
       </w:r>
     </w:p>
     <w:p>
@@ -1847,6 +1481,16 @@
       </w:pPr>
       <w:r>
         <w:rPr/>
+        <w:t>Незначимий це атрибут, який можна пропустити.</w:t>
+      </w:r>
+    </w:p>
+    <w:p>
+      <w:pPr>
+        <w:pStyle w:val="P1"/>
+        <w:rPr/>
+      </w:pPr>
+      <w:r>
+        <w:rPr/>
       </w:r>
     </w:p>
     <w:p>
@@ -1856,69 +1500,7 @@
       </w:pPr>
       <w:r>
         <w:rPr/>
-        <w:t xml:space="preserve">Який атрибут даних називають цільовим? Що таке значимий та незначимий атрибут? </w:t>
-      </w:r>
-    </w:p>
-    <w:p>
-      <w:pPr>
-        <w:pStyle w:val="P1"/>
-        <w:rPr/>
-      </w:pPr>
-      <w:r>
-        <w:rPr/>
-      </w:r>
-    </w:p>
-    <w:p>
-      <w:pPr>
-        <w:pStyle w:val="P1"/>
-        <w:rPr/>
-      </w:pPr>
-      <w:r>
-        <w:rPr/>
-        <w:t>Цільовим називають такий атрибут, який складно виміряти.</w:t>
-      </w:r>
-    </w:p>
-    <w:p>
-      <w:pPr>
-        <w:pStyle w:val="P1"/>
-        <w:rPr/>
-      </w:pPr>
-      <w:r>
-        <w:rPr/>
-        <w:t>Значимий це такий атрибут, який корисний.</w:t>
-      </w:r>
-    </w:p>
-    <w:p>
-      <w:pPr>
-        <w:pStyle w:val="P1"/>
-        <w:rPr/>
-      </w:pPr>
-      <w:r>
-        <w:rPr/>
-        <w:t>Незначимий це атрибут, який можна пропустити.</w:t>
-      </w:r>
-    </w:p>
-    <w:p>
-      <w:pPr>
-        <w:pStyle w:val="P1"/>
-        <w:rPr/>
-      </w:pPr>
-      <w:r>
-        <w:rPr/>
-      </w:r>
-    </w:p>
-    <w:p>
-      <w:pPr>
-        <w:pStyle w:val="H2"/>
-        <w:rPr/>
-      </w:pPr>
-      <w:r>
-        <w:rPr/>
-        <w:t>Які функції бібліотеки pandas ви знаєт</w:t>
-      </w:r>
-      <w:r>
-        <w:rPr/>
-        <w:t>е</w:t>
+        <w:t>Які функції бібліотеки pandas ви знаєте</w:t>
       </w:r>
     </w:p>
     <w:p>
@@ -2105,7 +1687,7 @@
         </w:rPr>
         <w:t xml:space="preserve">Джерело: </w:t>
       </w:r>
-      <w:hyperlink r:id="rId8">
+      <w:hyperlink r:id="rId7">
         <w:r>
           <w:rPr>
             <w:rStyle w:val="Hyperlink"/>
@@ -3380,13 +2962,13 @@
       <w:lang w:val="en-US" w:eastAsia="uk-UA"/>
     </w:rPr>
   </w:style>
+  <w:style w:type="character" w:styleId="Style12">
+    <w:name w:val="Символ нумерації"/>
+    <w:qFormat/>
+    <w:rPr/>
+  </w:style>
   <w:style w:type="character" w:styleId="user">
-    <w:name w:val="Символ нумерації (user)"/>
-    <w:qFormat/>
-    <w:rPr/>
-  </w:style>
-  <w:style w:type="character" w:styleId="Style12">
-    <w:name w:val="Маркери"/>
+    <w:name w:val="Маркери (user)"/>
     <w:qFormat/>
     <w:rPr>
       <w:rFonts w:ascii="OpenSymbol" w:hAnsi="OpenSymbol" w:eastAsia="OpenSymbol" w:cs="OpenSymbol"/>
@@ -3402,7 +2984,7 @@
       <w:spacing w:before="240" w:after="120"/>
     </w:pPr>
     <w:rPr>
-      <w:rFonts w:ascii="Liberation Sans" w:hAnsi="Liberation Sans" w:eastAsia="Microsoft YaHei" w:cs="Arial Unicode MS"/>
+      <w:rFonts w:ascii="Liberation Sans" w:hAnsi="Liberation Sans" w:eastAsia="Microsoft YaHei" w:cs="Lucida Sans"/>
       <w:sz w:val="28"/>
       <w:szCs w:val="28"/>
     </w:rPr>
@@ -3447,7 +3029,7 @@
       <w:suppressLineNumbers/>
     </w:pPr>
     <w:rPr>
-      <w:rFonts w:cs="Arial Unicode MS"/>
+      <w:rFonts w:cs="Lucida Sans"/>
     </w:rPr>
   </w:style>
   <w:style w:type="paragraph" w:styleId="user1">
@@ -3460,7 +3042,7 @@
       <w:spacing w:before="240" w:after="120"/>
     </w:pPr>
     <w:rPr>
-      <w:rFonts w:ascii="Liberation Sans" w:hAnsi="Liberation Sans" w:eastAsia="Microsoft YaHei" w:cs="Lucida Sans"/>
+      <w:rFonts w:ascii="Liberation Sans" w:hAnsi="Liberation Sans" w:eastAsia="Microsoft YaHei" w:cs="Arial Unicode MS"/>
       <w:sz w:val="28"/>
       <w:szCs w:val="28"/>
     </w:rPr>
@@ -3473,12 +3055,12 @@
       <w:suppressLineNumbers/>
     </w:pPr>
     <w:rPr>
-      <w:rFonts w:cs="Lucida Sans"/>
+      <w:rFonts w:cs="Arial Unicode MS"/>
     </w:rPr>
   </w:style>
   <w:style w:type="paragraph" w:styleId="IndexHeading">
     <w:name w:val="index heading"/>
-    <w:basedOn w:val="Style13"/>
+    <w:basedOn w:val="user1"/>
     <w:pPr/>
     <w:rPr/>
   </w:style>
@@ -3783,8 +3365,8 @@
     </w:pPr>
     <w:rPr/>
   </w:style>
-  <w:style w:type="numbering" w:styleId="Style15" w:default="1">
-    <w:name w:val="Без маркерів"/>
+  <w:style w:type="numbering" w:styleId="user3" w:default="1">
+    <w:name w:val="Без маркерів (user)"/>
     <w:uiPriority w:val="99"/>
     <w:semiHidden/>
     <w:unhideWhenUsed/>

</xml_diff>

<commit_message>
IA 2 done praise King Jesus
</commit_message>
<xml_diff>
--- a/41IA Intelektualnyj analiz danyh/2/BZ_KNT-122_Onyshchenko_19_PR2.docx
+++ b/41IA Intelektualnyj analiz danyh/2/BZ_KNT-122_Onyshchenko_19_PR2.docx
@@ -407,6 +407,7 @@
       <w:pPr>
         <w:pStyle w:val="h11"/>
         <w:spacing w:before="0" w:after="0"/>
+        <w:jc w:val="center"/>
         <w:rPr/>
       </w:pPr>
       <w:r>
@@ -445,6 +446,7 @@
     <w:p>
       <w:pPr>
         <w:pStyle w:val="h11"/>
+        <w:jc w:val="center"/>
         <w:rPr/>
       </w:pPr>
       <w:r>
@@ -587,7 +589,7 @@
       </w:pPr>
       <w:r>
         <w:rPr/>
-        <w:t xml:space="preserve">- описати всі атрибути, які характеризують екземпляри вибірки, та їх типи даних; </w:t>
+        <w:t>- описати всі атрибути, які характеризують екземпляри вибірки, та</w:t>
       </w:r>
     </w:p>
     <w:p>
@@ -607,7 +609,7 @@
       </w:pPr>
       <w:r>
         <w:rPr/>
-        <w:t xml:space="preserve">- визначити, який атрибут є цільовим, які значення він приймає та скільки екземплярів кожного класу в вибірці; </w:t>
+        <w:t xml:space="preserve">їх типи даних; </w:t>
       </w:r>
     </w:p>
     <w:p>
@@ -627,7 +629,7 @@
       </w:pPr>
       <w:r>
         <w:rPr/>
-        <w:t xml:space="preserve">- визначити чи є екземпляри з відсутніми значеннями. Якщо такі екземпляри є, то встановити їм відповідні значення використовуючи одну з наведених стратегії поведінки при роботі з пропущеними значеннями; </w:t>
+        <w:t xml:space="preserve">- визначити, який атрибут є цільовим, які значення він приймає та скільки екземплярів кожного класу в вибірці; </w:t>
       </w:r>
     </w:p>
     <w:p>
@@ -647,7 +649,7 @@
       </w:pPr>
       <w:r>
         <w:rPr/>
-        <w:t xml:space="preserve">- визначити чи є викиди даних; </w:t>
+        <w:t xml:space="preserve">- визначити чи є екземпляри з відсутніми значеннями. Якщо такі екземпляри є, то встановити їм відповідні значення використовуючи одну з наведених стратегії поведінки при роботі з пропущеними значеннями; </w:t>
       </w:r>
     </w:p>
     <w:p>
@@ -667,6 +669,26 @@
       </w:pPr>
       <w:r>
         <w:rPr/>
+        <w:t xml:space="preserve">- визначити чи є викиди даних; </w:t>
+      </w:r>
+    </w:p>
+    <w:p>
+      <w:pPr>
+        <w:pStyle w:val="p11"/>
+        <w:widowControl/>
+        <w:numPr>
+          <w:ilvl w:val="0"/>
+          <w:numId w:val="0"/>
+        </w:numPr>
+        <w:suppressAutoHyphens w:val="true"/>
+        <w:bidi w:val="0"/>
+        <w:spacing w:lineRule="auto" w:line="360" w:before="0" w:after="0"/>
+        <w:ind w:hanging="0" w:left="850" w:right="0"/>
+        <w:jc w:val="left"/>
+        <w:rPr/>
+      </w:pPr>
+      <w:r>
+        <w:rPr/>
         <w:t xml:space="preserve">- подати дані в графічному вигляді. </w:t>
       </w:r>
     </w:p>
@@ -802,6 +824,7 @@
     <w:p>
       <w:pPr>
         <w:pStyle w:val="h11"/>
+        <w:jc w:val="center"/>
         <w:rPr/>
       </w:pPr>
       <w:r>
@@ -811,58 +834,80 @@
     </w:p>
     <w:p>
       <w:pPr>
-        <w:pStyle w:val="p11"/>
-        <w:rPr/>
-      </w:pPr>
-      <w:r>
-        <w:rPr/>
-      </w:r>
-    </w:p>
-    <w:p>
-      <w:pPr>
-        <w:pStyle w:val="p11"/>
-        <w:rPr/>
-      </w:pPr>
-      <w:r>
-        <w:rPr/>
-        <w:t xml:space="preserve">Вибірку завантажено через кнопку </w:t>
-      </w:r>
-      <w:r>
-        <w:rPr>
-          <w:lang w:val="en-US"/>
-        </w:rPr>
-        <w:t xml:space="preserve">Open file. </w:t>
-      </w:r>
-      <w:r>
+        <w:pStyle w:val="H2"/>
+        <w:rPr/>
+      </w:pPr>
+      <w:r>
+        <w:rPr/>
+        <w:t>З</w:t>
+      </w:r>
+      <w:r>
+        <w:rPr/>
+        <w:t>авантаж</w:t>
+      </w:r>
+      <w:r>
+        <w:rPr/>
+        <w:t>ена</w:t>
+      </w:r>
+      <w:r>
+        <w:rPr/>
+        <w:t xml:space="preserve"> вибірк</w:t>
+      </w:r>
+      <w:r>
+        <w:rPr/>
+        <w:t>а</w:t>
+      </w:r>
+      <w:r>
+        <w:rPr/>
+        <w:t xml:space="preserve"> </w:t>
+      </w:r>
+    </w:p>
+    <w:p>
+      <w:pPr>
+        <w:pStyle w:val="P1"/>
+        <w:rPr/>
+      </w:pPr>
+      <w:r>
+        <w:rPr/>
+      </w:r>
+    </w:p>
+    <w:p>
+      <w:pPr>
+        <w:pStyle w:val="P1"/>
         <w:rPr>
           <w:lang w:val="uk-UA"/>
         </w:rPr>
-        <w:t>Описано на рисунку нижче:</w:t>
-      </w:r>
-    </w:p>
-    <w:p>
-      <w:pPr>
-        <w:pStyle w:val="p11"/>
+      </w:pPr>
+      <w:r>
         <w:rPr>
           <w:lang w:val="uk-UA"/>
         </w:rPr>
-      </w:pPr>
-      <w:r>
+        <w:t>Вибірку завантажено, деталі на рисунку нижче:</w:t>
+      </w:r>
+    </w:p>
+    <w:p>
+      <w:pPr>
+        <w:pStyle w:val="P1"/>
         <w:rPr>
           <w:lang w:val="uk-UA"/>
         </w:rPr>
-      </w:r>
-    </w:p>
-    <w:p>
-      <w:pPr>
-        <w:pStyle w:val="img11"/>
+      </w:pPr>
+      <w:r>
+        <w:rPr>
+          <w:lang w:val="uk-UA"/>
+        </w:rPr>
+      </w:r>
+    </w:p>
+    <w:p>
+      <w:pPr>
+        <w:pStyle w:val="IMG1"/>
         <w:rPr/>
       </w:pPr>
       <w:r>
         <w:rPr/>
         <w:drawing>
           <wp:inline distT="0" distB="0" distL="0" distR="0">
-            <wp:extent cx="5731510" cy="6161405"/>
+            <wp:extent cx="5731510" cy="5675630"/>
             <wp:effectExtent l="0" t="0" r="0" b="0"/>
             <wp:docPr id="1" name="Зображення1"/>
             <wp:cNvGraphicFramePr>
@@ -886,7 +931,7 @@
                   <pic:spPr bwMode="auto">
                     <a:xfrm>
                       <a:off x="0" y="0"/>
-                      <a:ext cx="5731510" cy="6161405"/>
+                      <a:ext cx="5731510" cy="5675630"/>
                     </a:xfrm>
                     <a:prstGeom prst="rect">
                       <a:avLst/>
@@ -902,40 +947,1404 @@
     </w:p>
     <w:p>
       <w:pPr>
-        <w:pStyle w:val="img11"/>
-        <w:rPr/>
-      </w:pPr>
-      <w:r>
-        <w:rPr/>
-        <w:t>Рисунок 1.1 — Завантажена вибірка</w:t>
-      </w:r>
-    </w:p>
-    <w:p>
-      <w:pPr>
-        <w:pStyle w:val="img11"/>
-        <w:rPr/>
-      </w:pPr>
-      <w:r>
-        <w:rPr/>
-      </w:r>
-    </w:p>
-    <w:p>
-      <w:pPr>
-        <w:pStyle w:val="p11"/>
-        <w:rPr/>
-      </w:pPr>
-      <w:r>
-        <w:rPr/>
-        <w:t>Далі описано атрибути вибірки. Наведено на рисунку нижче:</w:t>
-      </w:r>
-    </w:p>
-    <w:p>
-      <w:pPr>
-        <w:pStyle w:val="p11"/>
-        <w:rPr/>
-      </w:pPr>
-      <w:r>
-        <w:rPr/>
+        <w:pStyle w:val="IMG1"/>
+        <w:rPr/>
+      </w:pPr>
+      <w:r>
+        <w:rPr/>
+        <w:t>Рисунок 1.1 — Вибірка даних</w:t>
+      </w:r>
+    </w:p>
+    <w:p>
+      <w:pPr>
+        <w:pStyle w:val="P1"/>
+        <w:rPr/>
+      </w:pPr>
+      <w:r>
+        <w:rPr/>
+      </w:r>
+    </w:p>
+    <w:p>
+      <w:pPr>
+        <w:pStyle w:val="H2"/>
+        <w:rPr/>
+      </w:pPr>
+      <w:r>
+        <w:rPr/>
+        <w:t>Я</w:t>
+      </w:r>
+      <w:r>
+        <w:rPr/>
+        <w:t>ке практичне завдання вирішується</w:t>
+      </w:r>
+    </w:p>
+    <w:p>
+      <w:pPr>
+        <w:pStyle w:val="P1"/>
+        <w:rPr/>
+      </w:pPr>
+      <w:r>
+        <w:rPr/>
+      </w:r>
+    </w:p>
+    <w:p>
+      <w:pPr>
+        <w:pStyle w:val="P1"/>
+        <w:rPr/>
+      </w:pPr>
+      <w:r>
+        <w:rPr/>
+        <w:t>Ця вибірка вирішує задачу бінарної класифікації даних.</w:t>
+      </w:r>
+    </w:p>
+    <w:p>
+      <w:pPr>
+        <w:pStyle w:val="P1"/>
+        <w:rPr/>
+      </w:pPr>
+      <w:r>
+        <w:rPr/>
+        <w:t xml:space="preserve">Джерело: </w:t>
+      </w:r>
+      <w:hyperlink r:id="rId3">
+        <w:r>
+          <w:rPr>
+            <w:rStyle w:val="Hyperlink"/>
+          </w:rPr>
+          <w:t>https://www.kaggle.com/datasets/ruthgn/bank-marketing-data-set</w:t>
+        </w:r>
+      </w:hyperlink>
+      <w:r>
+        <w:rPr/>
+        <w:t xml:space="preserve">. </w:t>
+      </w:r>
+    </w:p>
+    <w:p>
+      <w:pPr>
+        <w:pStyle w:val="P1"/>
+        <w:rPr/>
+      </w:pPr>
+      <w:r>
+        <w:rPr/>
+      </w:r>
+    </w:p>
+    <w:p>
+      <w:pPr>
+        <w:pStyle w:val="H2"/>
+        <w:rPr/>
+      </w:pPr>
+      <w:r>
+        <w:rPr/>
+        <w:t>О</w:t>
+      </w:r>
+      <w:r>
+        <w:rPr/>
+        <w:t>писати всі атрибути вибірки, їх типи даних</w:t>
+      </w:r>
+    </w:p>
+    <w:p>
+      <w:pPr>
+        <w:pStyle w:val="P1"/>
+        <w:rPr/>
+      </w:pPr>
+      <w:r>
+        <w:rPr/>
+      </w:r>
+    </w:p>
+    <w:p>
+      <w:pPr>
+        <w:pStyle w:val="P1"/>
+        <w:ind w:hanging="0" w:left="0"/>
+        <w:rPr/>
+      </w:pPr>
+      <w:r>
+        <w:rPr/>
+        <w:tab/>
+      </w:r>
+      <w:r>
+        <w:rPr/>
+        <w:t>Опис атрибутів вибірки наведено нижче на таблиці.</w:t>
+      </w:r>
+    </w:p>
+    <w:p>
+      <w:pPr>
+        <w:pStyle w:val="P1"/>
+        <w:ind w:hanging="0" w:left="0"/>
+        <w:rPr/>
+      </w:pPr>
+      <w:r>
+        <w:rPr/>
+      </w:r>
+    </w:p>
+    <w:p>
+      <w:pPr>
+        <w:pStyle w:val="P1"/>
+        <w:rPr/>
+      </w:pPr>
+      <w:r>
+        <w:rPr/>
+        <w:t>Таблиця 1.1 — Дані вибірки</w:t>
+      </w:r>
+    </w:p>
+    <w:tbl>
+      <w:tblPr>
+        <w:tblW w:w="9026" w:type="dxa"/>
+        <w:jc w:val="left"/>
+        <w:tblInd w:w="55" w:type="dxa"/>
+        <w:tblLayout w:type="fixed"/>
+        <w:tblCellMar>
+          <w:top w:w="55" w:type="dxa"/>
+          <w:left w:w="55" w:type="dxa"/>
+          <w:bottom w:w="55" w:type="dxa"/>
+          <w:right w:w="55" w:type="dxa"/>
+        </w:tblCellMar>
+      </w:tblPr>
+      <w:tblGrid>
+        <w:gridCol w:w="2114"/>
+        <w:gridCol w:w="6912"/>
+      </w:tblGrid>
+      <w:tr>
+        <w:trPr/>
+        <w:tc>
+          <w:tcPr>
+            <w:tcW w:w="2114" w:type="dxa"/>
+            <w:tcBorders>
+              <w:top w:val="single" w:sz="4" w:space="0" w:color="000000"/>
+              <w:left w:val="single" w:sz="4" w:space="0" w:color="000000"/>
+              <w:bottom w:val="single" w:sz="4" w:space="0" w:color="000000"/>
+            </w:tcBorders>
+          </w:tcPr>
+          <w:p>
+            <w:pPr>
+              <w:pStyle w:val="Style15"/>
+              <w:spacing w:lineRule="auto" w:line="240"/>
+              <w:ind w:hanging="0" w:left="0"/>
+              <w:rPr>
+                <w:b/>
+                <w:bCs/>
+              </w:rPr>
+            </w:pPr>
+            <w:r>
+              <w:rPr>
+                <w:b/>
+                <w:bCs/>
+              </w:rPr>
+              <w:t>Назва атрибуту</w:t>
+            </w:r>
+          </w:p>
+        </w:tc>
+        <w:tc>
+          <w:tcPr>
+            <w:tcW w:w="6912" w:type="dxa"/>
+            <w:tcBorders>
+              <w:top w:val="single" w:sz="4" w:space="0" w:color="000000"/>
+              <w:left w:val="single" w:sz="4" w:space="0" w:color="000000"/>
+              <w:bottom w:val="single" w:sz="4" w:space="0" w:color="000000"/>
+              <w:right w:val="single" w:sz="4" w:space="0" w:color="000000"/>
+            </w:tcBorders>
+          </w:tcPr>
+          <w:p>
+            <w:pPr>
+              <w:pStyle w:val="Style15"/>
+              <w:spacing w:lineRule="auto" w:line="240"/>
+              <w:ind w:hanging="0" w:left="0"/>
+              <w:rPr>
+                <w:b/>
+                <w:bCs/>
+              </w:rPr>
+            </w:pPr>
+            <w:r>
+              <w:rPr>
+                <w:b/>
+                <w:bCs/>
+              </w:rPr>
+              <w:t>Його опис</w:t>
+            </w:r>
+          </w:p>
+        </w:tc>
+      </w:tr>
+      <w:tr>
+        <w:trPr/>
+        <w:tc>
+          <w:tcPr>
+            <w:tcW w:w="2114" w:type="dxa"/>
+            <w:tcBorders>
+              <w:left w:val="single" w:sz="4" w:space="0" w:color="000000"/>
+              <w:bottom w:val="single" w:sz="4" w:space="0" w:color="000000"/>
+            </w:tcBorders>
+          </w:tcPr>
+          <w:p>
+            <w:pPr>
+              <w:pStyle w:val="Style15"/>
+              <w:spacing w:lineRule="auto" w:line="240"/>
+              <w:ind w:hanging="0" w:left="0"/>
+              <w:rPr>
+                <w:lang w:val="en-US"/>
+              </w:rPr>
+            </w:pPr>
+            <w:r>
+              <w:rPr>
+                <w:lang w:val="en-US"/>
+              </w:rPr>
+              <w:t>Age</w:t>
+            </w:r>
+          </w:p>
+        </w:tc>
+        <w:tc>
+          <w:tcPr>
+            <w:tcW w:w="6912" w:type="dxa"/>
+            <w:tcBorders>
+              <w:left w:val="single" w:sz="4" w:space="0" w:color="000000"/>
+              <w:bottom w:val="single" w:sz="4" w:space="0" w:color="000000"/>
+              <w:right w:val="single" w:sz="4" w:space="0" w:color="000000"/>
+            </w:tcBorders>
+          </w:tcPr>
+          <w:p>
+            <w:pPr>
+              <w:pStyle w:val="Style15"/>
+              <w:spacing w:lineRule="auto" w:line="240"/>
+              <w:ind w:hanging="0" w:left="0"/>
+              <w:rPr/>
+            </w:pPr>
+            <w:r>
+              <w:rPr/>
+              <w:t>Вік користувача</w:t>
+            </w:r>
+          </w:p>
+        </w:tc>
+      </w:tr>
+      <w:tr>
+        <w:trPr/>
+        <w:tc>
+          <w:tcPr>
+            <w:tcW w:w="2114" w:type="dxa"/>
+            <w:tcBorders>
+              <w:left w:val="single" w:sz="4" w:space="0" w:color="000000"/>
+              <w:bottom w:val="single" w:sz="4" w:space="0" w:color="000000"/>
+            </w:tcBorders>
+          </w:tcPr>
+          <w:p>
+            <w:pPr>
+              <w:pStyle w:val="Style15"/>
+              <w:spacing w:lineRule="auto" w:line="240"/>
+              <w:ind w:hanging="0" w:left="0"/>
+              <w:rPr>
+                <w:lang w:val="en-US"/>
+              </w:rPr>
+            </w:pPr>
+            <w:r>
+              <w:rPr>
+                <w:lang w:val="en-US"/>
+              </w:rPr>
+              <w:t>Sex</w:t>
+            </w:r>
+          </w:p>
+        </w:tc>
+        <w:tc>
+          <w:tcPr>
+            <w:tcW w:w="6912" w:type="dxa"/>
+            <w:tcBorders>
+              <w:left w:val="single" w:sz="4" w:space="0" w:color="000000"/>
+              <w:bottom w:val="single" w:sz="4" w:space="0" w:color="000000"/>
+              <w:right w:val="single" w:sz="4" w:space="0" w:color="000000"/>
+            </w:tcBorders>
+          </w:tcPr>
+          <w:p>
+            <w:pPr>
+              <w:pStyle w:val="Style15"/>
+              <w:spacing w:lineRule="auto" w:line="240"/>
+              <w:ind w:hanging="0" w:left="0"/>
+              <w:rPr/>
+            </w:pPr>
+            <w:r>
+              <w:rPr/>
+              <w:t>Стать</w:t>
+            </w:r>
+          </w:p>
+        </w:tc>
+      </w:tr>
+      <w:tr>
+        <w:trPr/>
+        <w:tc>
+          <w:tcPr>
+            <w:tcW w:w="2114" w:type="dxa"/>
+            <w:tcBorders>
+              <w:left w:val="single" w:sz="4" w:space="0" w:color="000000"/>
+              <w:bottom w:val="single" w:sz="4" w:space="0" w:color="000000"/>
+            </w:tcBorders>
+          </w:tcPr>
+          <w:p>
+            <w:pPr>
+              <w:pStyle w:val="Style15"/>
+              <w:spacing w:lineRule="auto" w:line="240"/>
+              <w:ind w:hanging="0" w:left="0"/>
+              <w:rPr>
+                <w:lang w:val="en-US"/>
+              </w:rPr>
+            </w:pPr>
+            <w:r>
+              <w:rPr>
+                <w:lang w:val="en-US"/>
+              </w:rPr>
+              <w:t>Region</w:t>
+            </w:r>
+          </w:p>
+        </w:tc>
+        <w:tc>
+          <w:tcPr>
+            <w:tcW w:w="6912" w:type="dxa"/>
+            <w:tcBorders>
+              <w:left w:val="single" w:sz="4" w:space="0" w:color="000000"/>
+              <w:bottom w:val="single" w:sz="4" w:space="0" w:color="000000"/>
+              <w:right w:val="single" w:sz="4" w:space="0" w:color="000000"/>
+            </w:tcBorders>
+          </w:tcPr>
+          <w:p>
+            <w:pPr>
+              <w:pStyle w:val="Style15"/>
+              <w:spacing w:lineRule="auto" w:line="240"/>
+              <w:ind w:hanging="0" w:left="0"/>
+              <w:rPr>
+                <w:i w:val="false"/>
+                <w:i w:val="false"/>
+                <w:iCs w:val="false"/>
+                <w:lang w:val="en-US"/>
+              </w:rPr>
+            </w:pPr>
+            <w:r>
+              <w:rPr>
+                <w:i w:val="false"/>
+                <w:iCs w:val="false"/>
+                <w:lang w:val="uk-UA"/>
+              </w:rPr>
+              <w:t>Буває</w:t>
+            </w:r>
+            <w:r>
+              <w:rPr>
+                <w:i/>
+                <w:iCs/>
+                <w:lang w:val="uk-UA"/>
+              </w:rPr>
+              <w:t xml:space="preserve"> </w:t>
+            </w:r>
+            <w:r>
+              <w:rPr>
+                <w:i/>
+                <w:iCs/>
+                <w:lang w:val="en-US"/>
+              </w:rPr>
+              <w:t xml:space="preserve">inner_city </w:t>
+            </w:r>
+            <w:r>
+              <w:rPr>
+                <w:i w:val="false"/>
+                <w:iCs w:val="false"/>
+                <w:lang w:val="uk-UA"/>
+              </w:rPr>
+              <w:t xml:space="preserve">або </w:t>
+            </w:r>
+            <w:r>
+              <w:rPr>
+                <w:i/>
+                <w:iCs/>
+                <w:lang w:val="en-US"/>
+              </w:rPr>
+              <w:t xml:space="preserve">rural </w:t>
+            </w:r>
+            <w:r>
+              <w:rPr>
+                <w:i w:val="false"/>
+                <w:iCs w:val="false"/>
+                <w:lang w:val="en-US"/>
+              </w:rPr>
+              <w:t>а</w:t>
+            </w:r>
+            <w:r>
+              <w:rPr>
+                <w:i w:val="false"/>
+                <w:iCs w:val="false"/>
+                <w:lang w:val="uk-UA"/>
+              </w:rPr>
+              <w:t xml:space="preserve">бо </w:t>
+            </w:r>
+            <w:r>
+              <w:rPr>
+                <w:i/>
+                <w:iCs/>
+                <w:lang w:val="en-US"/>
+              </w:rPr>
+              <w:t xml:space="preserve">suburban </w:t>
+            </w:r>
+            <w:r>
+              <w:rPr>
+                <w:i w:val="false"/>
+                <w:iCs w:val="false"/>
+                <w:lang w:val="uk-UA"/>
+              </w:rPr>
+              <w:t>або</w:t>
+            </w:r>
+            <w:r>
+              <w:rPr>
+                <w:i w:val="false"/>
+                <w:iCs w:val="false"/>
+                <w:lang w:val="en-US"/>
+              </w:rPr>
+              <w:t xml:space="preserve"> </w:t>
+            </w:r>
+            <w:r>
+              <w:rPr>
+                <w:i/>
+                <w:iCs/>
+                <w:lang w:val="en-US"/>
+              </w:rPr>
+              <w:t>town</w:t>
+            </w:r>
+          </w:p>
+        </w:tc>
+      </w:tr>
+      <w:tr>
+        <w:trPr/>
+        <w:tc>
+          <w:tcPr>
+            <w:tcW w:w="2114" w:type="dxa"/>
+            <w:tcBorders>
+              <w:left w:val="single" w:sz="4" w:space="0" w:color="000000"/>
+              <w:bottom w:val="single" w:sz="4" w:space="0" w:color="000000"/>
+            </w:tcBorders>
+          </w:tcPr>
+          <w:p>
+            <w:pPr>
+              <w:pStyle w:val="Style15"/>
+              <w:spacing w:lineRule="auto" w:line="240"/>
+              <w:ind w:hanging="0" w:left="0"/>
+              <w:rPr>
+                <w:lang w:val="en-US"/>
+              </w:rPr>
+            </w:pPr>
+            <w:r>
+              <w:rPr>
+                <w:lang w:val="en-US"/>
+              </w:rPr>
+              <w:t>Income</w:t>
+            </w:r>
+          </w:p>
+        </w:tc>
+        <w:tc>
+          <w:tcPr>
+            <w:tcW w:w="6912" w:type="dxa"/>
+            <w:tcBorders>
+              <w:left w:val="single" w:sz="4" w:space="0" w:color="000000"/>
+              <w:bottom w:val="single" w:sz="4" w:space="0" w:color="000000"/>
+              <w:right w:val="single" w:sz="4" w:space="0" w:color="000000"/>
+            </w:tcBorders>
+          </w:tcPr>
+          <w:p>
+            <w:pPr>
+              <w:pStyle w:val="Style15"/>
+              <w:spacing w:lineRule="auto" w:line="240"/>
+              <w:ind w:hanging="0" w:left="0"/>
+              <w:rPr>
+                <w:i w:val="false"/>
+                <w:i w:val="false"/>
+                <w:iCs w:val="false"/>
+                <w:lang w:val="uk-UA"/>
+              </w:rPr>
+            </w:pPr>
+            <w:r>
+              <w:rPr>
+                <w:i w:val="false"/>
+                <w:iCs w:val="false"/>
+                <w:lang w:val="uk-UA"/>
+              </w:rPr>
+              <w:t>Числове значення прибутку користувача</w:t>
+            </w:r>
+          </w:p>
+        </w:tc>
+      </w:tr>
+      <w:tr>
+        <w:trPr/>
+        <w:tc>
+          <w:tcPr>
+            <w:tcW w:w="2114" w:type="dxa"/>
+            <w:tcBorders>
+              <w:left w:val="single" w:sz="4" w:space="0" w:color="000000"/>
+              <w:bottom w:val="single" w:sz="4" w:space="0" w:color="000000"/>
+            </w:tcBorders>
+          </w:tcPr>
+          <w:p>
+            <w:pPr>
+              <w:pStyle w:val="Style15"/>
+              <w:spacing w:lineRule="auto" w:line="240"/>
+              <w:ind w:hanging="0" w:left="0"/>
+              <w:rPr>
+                <w:lang w:val="en-US"/>
+              </w:rPr>
+            </w:pPr>
+            <w:r>
+              <w:rPr>
+                <w:lang w:val="en-US"/>
+              </w:rPr>
+              <w:t>Married</w:t>
+            </w:r>
+          </w:p>
+        </w:tc>
+        <w:tc>
+          <w:tcPr>
+            <w:tcW w:w="6912" w:type="dxa"/>
+            <w:tcBorders>
+              <w:left w:val="single" w:sz="4" w:space="0" w:color="000000"/>
+              <w:bottom w:val="single" w:sz="4" w:space="0" w:color="000000"/>
+              <w:right w:val="single" w:sz="4" w:space="0" w:color="000000"/>
+            </w:tcBorders>
+          </w:tcPr>
+          <w:p>
+            <w:pPr>
+              <w:pStyle w:val="Style15"/>
+              <w:spacing w:lineRule="auto" w:line="240"/>
+              <w:ind w:hanging="0" w:left="0"/>
+              <w:rPr>
+                <w:i w:val="false"/>
+                <w:i w:val="false"/>
+                <w:iCs w:val="false"/>
+                <w:lang w:val="uk-UA"/>
+              </w:rPr>
+            </w:pPr>
+            <w:r>
+              <w:rPr>
+                <w:i w:val="false"/>
+                <w:iCs w:val="false"/>
+                <w:lang w:val="uk-UA"/>
+              </w:rPr>
+              <w:t>Чи є користувач одруженим</w:t>
+            </w:r>
+          </w:p>
+        </w:tc>
+      </w:tr>
+      <w:tr>
+        <w:trPr/>
+        <w:tc>
+          <w:tcPr>
+            <w:tcW w:w="2114" w:type="dxa"/>
+            <w:tcBorders>
+              <w:left w:val="single" w:sz="4" w:space="0" w:color="000000"/>
+              <w:bottom w:val="single" w:sz="4" w:space="0" w:color="000000"/>
+            </w:tcBorders>
+          </w:tcPr>
+          <w:p>
+            <w:pPr>
+              <w:pStyle w:val="Style15"/>
+              <w:spacing w:lineRule="auto" w:line="240"/>
+              <w:ind w:hanging="0" w:left="0"/>
+              <w:rPr>
+                <w:lang w:val="en-US"/>
+              </w:rPr>
+            </w:pPr>
+            <w:r>
+              <w:rPr>
+                <w:lang w:val="en-US"/>
+              </w:rPr>
+              <w:t>Children</w:t>
+            </w:r>
+          </w:p>
+        </w:tc>
+        <w:tc>
+          <w:tcPr>
+            <w:tcW w:w="6912" w:type="dxa"/>
+            <w:tcBorders>
+              <w:left w:val="single" w:sz="4" w:space="0" w:color="000000"/>
+              <w:bottom w:val="single" w:sz="4" w:space="0" w:color="000000"/>
+              <w:right w:val="single" w:sz="4" w:space="0" w:color="000000"/>
+            </w:tcBorders>
+          </w:tcPr>
+          <w:p>
+            <w:pPr>
+              <w:pStyle w:val="Style15"/>
+              <w:spacing w:lineRule="auto" w:line="240"/>
+              <w:ind w:hanging="0" w:left="0"/>
+              <w:rPr>
+                <w:i w:val="false"/>
+                <w:i w:val="false"/>
+                <w:iCs w:val="false"/>
+                <w:lang w:val="uk-UA"/>
+              </w:rPr>
+            </w:pPr>
+            <w:r>
+              <w:rPr>
+                <w:i w:val="false"/>
+                <w:iCs w:val="false"/>
+                <w:lang w:val="uk-UA"/>
+              </w:rPr>
+              <w:t>Кількість дітей</w:t>
+            </w:r>
+          </w:p>
+        </w:tc>
+      </w:tr>
+      <w:tr>
+        <w:trPr/>
+        <w:tc>
+          <w:tcPr>
+            <w:tcW w:w="2114" w:type="dxa"/>
+            <w:tcBorders>
+              <w:left w:val="single" w:sz="4" w:space="0" w:color="000000"/>
+              <w:bottom w:val="single" w:sz="4" w:space="0" w:color="000000"/>
+            </w:tcBorders>
+          </w:tcPr>
+          <w:p>
+            <w:pPr>
+              <w:pStyle w:val="Style15"/>
+              <w:spacing w:lineRule="auto" w:line="240"/>
+              <w:ind w:hanging="0" w:left="0"/>
+              <w:rPr>
+                <w:lang w:val="en-US"/>
+              </w:rPr>
+            </w:pPr>
+            <w:r>
+              <w:rPr>
+                <w:lang w:val="en-US"/>
+              </w:rPr>
+              <w:t>Car</w:t>
+            </w:r>
+          </w:p>
+        </w:tc>
+        <w:tc>
+          <w:tcPr>
+            <w:tcW w:w="6912" w:type="dxa"/>
+            <w:tcBorders>
+              <w:left w:val="single" w:sz="4" w:space="0" w:color="000000"/>
+              <w:bottom w:val="single" w:sz="4" w:space="0" w:color="000000"/>
+              <w:right w:val="single" w:sz="4" w:space="0" w:color="000000"/>
+            </w:tcBorders>
+          </w:tcPr>
+          <w:p>
+            <w:pPr>
+              <w:pStyle w:val="Style15"/>
+              <w:spacing w:lineRule="auto" w:line="240"/>
+              <w:ind w:hanging="0" w:left="0"/>
+              <w:rPr>
+                <w:i w:val="false"/>
+                <w:i w:val="false"/>
+                <w:iCs w:val="false"/>
+                <w:lang w:val="uk-UA"/>
+              </w:rPr>
+            </w:pPr>
+            <w:r>
+              <w:rPr>
+                <w:i w:val="false"/>
+                <w:iCs w:val="false"/>
+                <w:lang w:val="uk-UA"/>
+              </w:rPr>
+              <w:t>Чи є користувач власником машини</w:t>
+            </w:r>
+          </w:p>
+        </w:tc>
+      </w:tr>
+      <w:tr>
+        <w:trPr/>
+        <w:tc>
+          <w:tcPr>
+            <w:tcW w:w="2114" w:type="dxa"/>
+            <w:tcBorders>
+              <w:left w:val="single" w:sz="4" w:space="0" w:color="000000"/>
+              <w:bottom w:val="single" w:sz="4" w:space="0" w:color="000000"/>
+            </w:tcBorders>
+          </w:tcPr>
+          <w:p>
+            <w:pPr>
+              <w:pStyle w:val="Style15"/>
+              <w:spacing w:lineRule="auto" w:line="240"/>
+              <w:ind w:hanging="0" w:left="0"/>
+              <w:rPr>
+                <w:lang w:val="en-US"/>
+              </w:rPr>
+            </w:pPr>
+            <w:r>
+              <w:rPr>
+                <w:lang w:val="en-US"/>
+              </w:rPr>
+              <w:t>Save_Act</w:t>
+            </w:r>
+          </w:p>
+        </w:tc>
+        <w:tc>
+          <w:tcPr>
+            <w:tcW w:w="6912" w:type="dxa"/>
+            <w:tcBorders>
+              <w:left w:val="single" w:sz="4" w:space="0" w:color="000000"/>
+              <w:bottom w:val="single" w:sz="4" w:space="0" w:color="000000"/>
+              <w:right w:val="single" w:sz="4" w:space="0" w:color="000000"/>
+            </w:tcBorders>
+          </w:tcPr>
+          <w:p>
+            <w:pPr>
+              <w:pStyle w:val="Style15"/>
+              <w:spacing w:lineRule="auto" w:line="240"/>
+              <w:ind w:hanging="0" w:left="0"/>
+              <w:rPr>
+                <w:i w:val="false"/>
+                <w:i w:val="false"/>
+                <w:iCs w:val="false"/>
+                <w:lang w:val="uk-UA"/>
+              </w:rPr>
+            </w:pPr>
+            <w:r>
+              <w:rPr>
+                <w:i w:val="false"/>
+                <w:iCs w:val="false"/>
+                <w:lang w:val="uk-UA"/>
+              </w:rPr>
+              <w:t>Чи має користувач накопичувальний рахунок</w:t>
+            </w:r>
+          </w:p>
+        </w:tc>
+      </w:tr>
+      <w:tr>
+        <w:trPr/>
+        <w:tc>
+          <w:tcPr>
+            <w:tcW w:w="2114" w:type="dxa"/>
+            <w:tcBorders>
+              <w:left w:val="single" w:sz="4" w:space="0" w:color="000000"/>
+              <w:bottom w:val="single" w:sz="4" w:space="0" w:color="000000"/>
+            </w:tcBorders>
+          </w:tcPr>
+          <w:p>
+            <w:pPr>
+              <w:pStyle w:val="Style15"/>
+              <w:spacing w:lineRule="auto" w:line="240"/>
+              <w:ind w:hanging="0" w:left="0"/>
+              <w:rPr>
+                <w:lang w:val="en-US"/>
+              </w:rPr>
+            </w:pPr>
+            <w:r>
+              <w:rPr>
+                <w:lang w:val="en-US"/>
+              </w:rPr>
+              <w:t>Current_Act</w:t>
+            </w:r>
+          </w:p>
+        </w:tc>
+        <w:tc>
+          <w:tcPr>
+            <w:tcW w:w="6912" w:type="dxa"/>
+            <w:tcBorders>
+              <w:left w:val="single" w:sz="4" w:space="0" w:color="000000"/>
+              <w:bottom w:val="single" w:sz="4" w:space="0" w:color="000000"/>
+              <w:right w:val="single" w:sz="4" w:space="0" w:color="000000"/>
+            </w:tcBorders>
+          </w:tcPr>
+          <w:p>
+            <w:pPr>
+              <w:pStyle w:val="Style15"/>
+              <w:spacing w:lineRule="auto" w:line="240"/>
+              <w:ind w:hanging="0" w:left="0"/>
+              <w:rPr>
+                <w:i w:val="false"/>
+                <w:i w:val="false"/>
+                <w:iCs w:val="false"/>
+                <w:lang w:val="uk-UA"/>
+              </w:rPr>
+            </w:pPr>
+            <w:r>
+              <w:rPr>
+                <w:i w:val="false"/>
+                <w:iCs w:val="false"/>
+                <w:lang w:val="uk-UA"/>
+              </w:rPr>
+              <w:t>Чи має користувач поточний рахунок</w:t>
+            </w:r>
+          </w:p>
+        </w:tc>
+      </w:tr>
+      <w:tr>
+        <w:trPr/>
+        <w:tc>
+          <w:tcPr>
+            <w:tcW w:w="2114" w:type="dxa"/>
+            <w:tcBorders>
+              <w:left w:val="single" w:sz="4" w:space="0" w:color="000000"/>
+              <w:bottom w:val="single" w:sz="4" w:space="0" w:color="000000"/>
+            </w:tcBorders>
+          </w:tcPr>
+          <w:p>
+            <w:pPr>
+              <w:pStyle w:val="Style15"/>
+              <w:spacing w:lineRule="auto" w:line="240"/>
+              <w:ind w:hanging="0" w:left="0"/>
+              <w:rPr>
+                <w:lang w:val="en-US"/>
+              </w:rPr>
+            </w:pPr>
+            <w:r>
+              <w:rPr>
+                <w:lang w:val="en-US"/>
+              </w:rPr>
+              <w:t>Morgage</w:t>
+            </w:r>
+          </w:p>
+        </w:tc>
+        <w:tc>
+          <w:tcPr>
+            <w:tcW w:w="6912" w:type="dxa"/>
+            <w:tcBorders>
+              <w:left w:val="single" w:sz="4" w:space="0" w:color="000000"/>
+              <w:bottom w:val="single" w:sz="4" w:space="0" w:color="000000"/>
+              <w:right w:val="single" w:sz="4" w:space="0" w:color="000000"/>
+            </w:tcBorders>
+          </w:tcPr>
+          <w:p>
+            <w:pPr>
+              <w:pStyle w:val="Style15"/>
+              <w:spacing w:lineRule="auto" w:line="240"/>
+              <w:ind w:hanging="0" w:left="0"/>
+              <w:rPr>
+                <w:i w:val="false"/>
+                <w:i w:val="false"/>
+                <w:iCs w:val="false"/>
+                <w:lang w:val="uk-UA"/>
+              </w:rPr>
+            </w:pPr>
+            <w:r>
+              <w:rPr>
+                <w:i w:val="false"/>
+                <w:iCs w:val="false"/>
+                <w:lang w:val="uk-UA"/>
+              </w:rPr>
+              <w:t>Чи має користувач іпотечний рахунок</w:t>
+            </w:r>
+          </w:p>
+        </w:tc>
+      </w:tr>
+      <w:tr>
+        <w:trPr/>
+        <w:tc>
+          <w:tcPr>
+            <w:tcW w:w="2114" w:type="dxa"/>
+            <w:tcBorders>
+              <w:left w:val="single" w:sz="4" w:space="0" w:color="000000"/>
+              <w:bottom w:val="single" w:sz="4" w:space="0" w:color="000000"/>
+            </w:tcBorders>
+          </w:tcPr>
+          <w:p>
+            <w:pPr>
+              <w:pStyle w:val="Style15"/>
+              <w:spacing w:lineRule="auto" w:line="240"/>
+              <w:ind w:hanging="0" w:left="0"/>
+              <w:rPr>
+                <w:lang w:val="en-US"/>
+              </w:rPr>
+            </w:pPr>
+            <w:r>
+              <w:rPr>
+                <w:lang w:val="en-US"/>
+              </w:rPr>
+              <w:t>Pep</w:t>
+            </w:r>
+          </w:p>
+        </w:tc>
+        <w:tc>
+          <w:tcPr>
+            <w:tcW w:w="6912" w:type="dxa"/>
+            <w:tcBorders>
+              <w:left w:val="single" w:sz="4" w:space="0" w:color="000000"/>
+              <w:bottom w:val="single" w:sz="4" w:space="0" w:color="000000"/>
+              <w:right w:val="single" w:sz="4" w:space="0" w:color="000000"/>
+            </w:tcBorders>
+          </w:tcPr>
+          <w:p>
+            <w:pPr>
+              <w:pStyle w:val="Style15"/>
+              <w:spacing w:lineRule="auto" w:line="240"/>
+              <w:ind w:hanging="0" w:left="0"/>
+              <w:rPr>
+                <w:i w:val="false"/>
+                <w:i w:val="false"/>
+                <w:iCs w:val="false"/>
+                <w:lang w:val="uk-UA"/>
+              </w:rPr>
+            </w:pPr>
+            <w:r>
+              <w:rPr>
+                <w:i w:val="false"/>
+                <w:iCs w:val="false"/>
+                <w:lang w:val="uk-UA"/>
+              </w:rPr>
+              <w:t xml:space="preserve">Чи придбав користувач </w:t>
+            </w:r>
+            <w:r>
+              <w:rPr>
+                <w:i w:val="false"/>
+                <w:iCs w:val="false"/>
+                <w:lang w:val="en-US"/>
+              </w:rPr>
+              <w:t xml:space="preserve">PEP (Personal Equity Plan) </w:t>
+            </w:r>
+            <w:r>
+              <w:rPr>
+                <w:i w:val="false"/>
+                <w:iCs w:val="false"/>
+                <w:lang w:val="uk-UA"/>
+              </w:rPr>
+              <w:t>після останнього листування</w:t>
+            </w:r>
+          </w:p>
+        </w:tc>
+      </w:tr>
+    </w:tbl>
+    <w:p>
+      <w:pPr>
+        <w:pStyle w:val="P1"/>
+        <w:rPr/>
+      </w:pPr>
+      <w:r>
+        <w:rPr/>
+      </w:r>
+    </w:p>
+    <w:p>
+      <w:pPr>
+        <w:pStyle w:val="P1"/>
+        <w:rPr>
+          <w:lang w:val="uk-UA"/>
+        </w:rPr>
+      </w:pPr>
+      <w:r>
+        <w:rPr>
+          <w:lang w:val="uk-UA"/>
+        </w:rPr>
+        <w:t xml:space="preserve">Джерело: </w:t>
+      </w:r>
+      <w:hyperlink r:id="rId4">
+        <w:r>
+          <w:rPr>
+            <w:rStyle w:val="Hyperlink"/>
+            <w:lang w:val="uk-UA"/>
+          </w:rPr>
+          <w:t>http://facweb.cs.depaul.edu/mobasher/classes/ect584/WEKA/preprocess.html</w:t>
+        </w:r>
+      </w:hyperlink>
+      <w:r>
+        <w:rPr>
+          <w:lang w:val="uk-UA"/>
+        </w:rPr>
+        <w:t xml:space="preserve">. </w:t>
+      </w:r>
+    </w:p>
+    <w:p>
+      <w:pPr>
+        <w:pStyle w:val="P1"/>
+        <w:rPr/>
+      </w:pPr>
+      <w:r>
+        <w:rPr/>
+      </w:r>
+    </w:p>
+    <w:p>
+      <w:pPr>
+        <w:pStyle w:val="H2"/>
+        <w:rPr/>
+      </w:pPr>
+      <w:r>
+        <w:rPr/>
+        <w:t>В</w:t>
+      </w:r>
+      <w:r>
+        <w:rPr/>
+        <w:t>изначити, який атрибут є цільовим, які значення приймає; скільки екземплярів кожного класу в вибірці</w:t>
+      </w:r>
+    </w:p>
+    <w:p>
+      <w:pPr>
+        <w:pStyle w:val="P1"/>
+        <w:rPr/>
+      </w:pPr>
+      <w:r>
+        <w:rPr/>
+      </w:r>
+    </w:p>
+    <w:p>
+      <w:pPr>
+        <w:pStyle w:val="P1"/>
+        <w:rPr>
+          <w:lang w:val="uk-UA"/>
+        </w:rPr>
+      </w:pPr>
+      <w:r>
+        <w:rPr>
+          <w:lang w:val="uk-UA"/>
+        </w:rPr>
+        <w:t xml:space="preserve">Цільовим є атрибут </w:t>
+      </w:r>
+      <w:r>
+        <w:rPr>
+          <w:i/>
+          <w:iCs/>
+          <w:lang w:val="en-US"/>
+        </w:rPr>
+        <w:t>pep</w:t>
+      </w:r>
+      <w:r>
+        <w:rPr>
+          <w:lang w:val="en-US"/>
+        </w:rPr>
+        <w:t>.</w:t>
+      </w:r>
+    </w:p>
+    <w:p>
+      <w:pPr>
+        <w:pStyle w:val="P1"/>
+        <w:rPr>
+          <w:lang w:val="uk-UA"/>
+        </w:rPr>
+      </w:pPr>
+      <w:r>
+        <w:rPr>
+          <w:lang w:val="uk-UA"/>
+        </w:rPr>
+        <w:t xml:space="preserve">Він приймає значення </w:t>
+      </w:r>
+      <w:r>
+        <w:rPr>
+          <w:lang w:val="en-US"/>
+        </w:rPr>
+        <w:t xml:space="preserve">YES </w:t>
+      </w:r>
+      <w:r>
+        <w:rPr>
+          <w:lang w:val="uk-UA"/>
+        </w:rPr>
+        <w:t xml:space="preserve">або </w:t>
+      </w:r>
+      <w:r>
+        <w:rPr>
+          <w:lang w:val="en-US"/>
+        </w:rPr>
+        <w:t>NO.</w:t>
+      </w:r>
+    </w:p>
+    <w:p>
+      <w:pPr>
+        <w:pStyle w:val="P1"/>
+        <w:rPr>
+          <w:lang w:val="uk-UA"/>
+        </w:rPr>
+      </w:pPr>
+      <w:r>
+        <w:rPr>
+          <w:lang w:val="uk-UA"/>
+        </w:rPr>
+        <w:t xml:space="preserve">Для </w:t>
+      </w:r>
+      <w:r>
+        <w:rPr>
+          <w:lang w:val="en-US"/>
+        </w:rPr>
+        <w:t xml:space="preserve">YES </w:t>
+      </w:r>
+      <w:r>
+        <w:rPr>
+          <w:lang w:val="uk-UA"/>
+        </w:rPr>
+        <w:t>є 274 екземпляри, а для класу N</w:t>
+      </w:r>
+      <w:r>
+        <w:rPr>
+          <w:lang w:val="en-US"/>
+        </w:rPr>
+        <w:t>O – 326.</w:t>
+      </w:r>
+    </w:p>
+    <w:p>
+      <w:pPr>
+        <w:pStyle w:val="P1"/>
+        <w:rPr/>
+      </w:pPr>
+      <w:r>
+        <w:rPr/>
+      </w:r>
+    </w:p>
+    <w:p>
+      <w:pPr>
+        <w:pStyle w:val="H2"/>
+        <w:rPr/>
+      </w:pPr>
+      <w:r>
+        <w:rPr/>
+        <w:t>Ч</w:t>
+      </w:r>
+      <w:r>
+        <w:rPr/>
+        <w:t>и є екземпляри з відсутніми значеннями</w:t>
+      </w:r>
+    </w:p>
+    <w:p>
+      <w:pPr>
+        <w:pStyle w:val="P1"/>
+        <w:rPr>
+          <w:i w:val="false"/>
+          <w:i w:val="false"/>
+          <w:iCs w:val="false"/>
+          <w:lang w:val="uk-UA"/>
+        </w:rPr>
+      </w:pPr>
+      <w:r>
+        <w:rPr>
+          <w:i w:val="false"/>
+          <w:iCs w:val="false"/>
+          <w:lang w:val="uk-UA"/>
+        </w:rPr>
+      </w:r>
+    </w:p>
+    <w:p>
+      <w:pPr>
+        <w:pStyle w:val="P1"/>
+        <w:rPr>
+          <w:i w:val="false"/>
+          <w:i w:val="false"/>
+          <w:iCs w:val="false"/>
+          <w:lang w:val="uk-UA"/>
+        </w:rPr>
+      </w:pPr>
+      <w:r>
+        <w:rPr>
+          <w:i w:val="false"/>
+          <w:iCs w:val="false"/>
+          <w:lang w:val="uk-UA"/>
+        </w:rPr>
+        <w:t xml:space="preserve">Для виконання потрібно подивитись на поле </w:t>
+      </w:r>
+      <w:r>
+        <w:rPr>
+          <w:i/>
+          <w:iCs/>
+          <w:lang w:val="en-US"/>
+        </w:rPr>
+        <w:t>Missing</w:t>
+      </w:r>
+      <w:r>
+        <w:rPr>
+          <w:i w:val="false"/>
+          <w:iCs w:val="false"/>
+          <w:lang w:val="en-US"/>
+        </w:rPr>
+        <w:t xml:space="preserve"> </w:t>
+      </w:r>
+      <w:r>
+        <w:rPr>
+          <w:i w:val="false"/>
+          <w:iCs w:val="false"/>
+          <w:lang w:val="uk-UA"/>
+        </w:rPr>
+        <w:t>для кожного атрибуту.</w:t>
+      </w:r>
+    </w:p>
+    <w:p>
+      <w:pPr>
+        <w:pStyle w:val="P1"/>
+        <w:rPr>
+          <w:i w:val="false"/>
+          <w:i w:val="false"/>
+          <w:iCs w:val="false"/>
+          <w:lang w:val="uk-UA"/>
+        </w:rPr>
+      </w:pPr>
+      <w:r>
+        <w:rPr>
+          <w:i w:val="false"/>
+          <w:iCs w:val="false"/>
+          <w:lang w:val="uk-UA"/>
+        </w:rPr>
+        <w:t>Викидів немає для жодного атрибуту.</w:t>
+      </w:r>
+    </w:p>
+    <w:p>
+      <w:pPr>
+        <w:pStyle w:val="P1"/>
+        <w:rPr/>
+      </w:pPr>
+      <w:r>
+        <w:rPr/>
+      </w:r>
+    </w:p>
+    <w:p>
+      <w:pPr>
+        <w:pStyle w:val="H2"/>
+        <w:rPr/>
+      </w:pPr>
+      <w:r>
+        <w:rPr/>
+        <w:t>Ч</w:t>
+      </w:r>
+      <w:r>
+        <w:rPr/>
+        <w:t>и є викиди даних</w:t>
+      </w:r>
+    </w:p>
+    <w:p>
+      <w:pPr>
+        <w:pStyle w:val="P1"/>
+        <w:rPr/>
+      </w:pPr>
+      <w:r>
+        <w:rPr/>
+      </w:r>
+    </w:p>
+    <w:p>
+      <w:pPr>
+        <w:pStyle w:val="P1"/>
+        <w:rPr/>
+      </w:pPr>
+      <w:r>
+        <w:rPr/>
+        <w:t xml:space="preserve">Для цього потрібно застосувати фільтр </w:t>
+      </w:r>
+      <w:r>
+        <w:rPr>
+          <w:i/>
+          <w:iCs/>
+          <w:lang w:val="en-US"/>
+        </w:rPr>
+        <w:t>InterquartileRange</w:t>
+      </w:r>
+      <w:r>
+        <w:rPr>
+          <w:i w:val="false"/>
+          <w:iCs w:val="false"/>
+          <w:lang w:val="en-US"/>
+        </w:rPr>
+        <w:t>.</w:t>
+      </w:r>
+    </w:p>
+    <w:p>
+      <w:pPr>
+        <w:pStyle w:val="P1"/>
+        <w:rPr>
+          <w:i w:val="false"/>
+          <w:i w:val="false"/>
+          <w:iCs w:val="false"/>
+          <w:lang w:val="uk-UA"/>
+        </w:rPr>
+      </w:pPr>
+      <w:r>
+        <w:rPr>
+          <w:i w:val="false"/>
+          <w:iCs w:val="false"/>
+          <w:lang w:val="uk-UA"/>
+        </w:rPr>
+        <w:t xml:space="preserve">Кількість викидів показується у доданому атрибуті </w:t>
+      </w:r>
+      <w:r>
+        <w:rPr>
+          <w:i/>
+          <w:iCs/>
+          <w:lang w:val="en-US"/>
+        </w:rPr>
+        <w:t>Outlier</w:t>
+      </w:r>
+      <w:r>
+        <w:rPr>
+          <w:i w:val="false"/>
+          <w:iCs w:val="false"/>
+          <w:lang w:val="en-US"/>
+        </w:rPr>
+        <w:t>.</w:t>
+      </w:r>
+    </w:p>
+    <w:p>
+      <w:pPr>
+        <w:pStyle w:val="P1"/>
+        <w:rPr>
+          <w:i w:val="false"/>
+          <w:i w:val="false"/>
+          <w:iCs w:val="false"/>
+          <w:lang w:val="uk-UA"/>
+        </w:rPr>
+      </w:pPr>
+      <w:r>
+        <w:rPr>
+          <w:i w:val="false"/>
+          <w:iCs w:val="false"/>
+          <w:lang w:val="uk-UA"/>
+        </w:rPr>
+        <w:t>Викидів не знайдено.</w:t>
+      </w:r>
+    </w:p>
+    <w:p>
+      <w:pPr>
+        <w:pStyle w:val="P1"/>
+        <w:rPr/>
+      </w:pPr>
+      <w:r>
+        <w:rPr/>
+      </w:r>
+    </w:p>
+    <w:p>
+      <w:pPr>
+        <w:pStyle w:val="H2"/>
+        <w:rPr/>
+      </w:pPr>
+      <w:r>
+        <w:rPr/>
+        <w:t>Д</w:t>
+      </w:r>
+      <w:r>
+        <w:rPr/>
+        <w:t>ані в графічному вигляді</w:t>
+      </w:r>
+    </w:p>
+    <w:p>
+      <w:pPr>
+        <w:pStyle w:val="P1"/>
+        <w:rPr/>
+      </w:pPr>
+      <w:r>
+        <w:rPr/>
+      </w:r>
+    </w:p>
+    <w:p>
+      <w:pPr>
+        <w:pStyle w:val="P1"/>
+        <w:rPr/>
+      </w:pPr>
+      <w:r>
+        <w:rPr/>
+        <w:t xml:space="preserve">Для вхідної ознаки </w:t>
+      </w:r>
+      <w:r>
+        <w:rPr>
+          <w:lang w:val="en-US"/>
+        </w:rPr>
+        <w:t xml:space="preserve">Age </w:t>
+      </w:r>
+      <w:r>
+        <w:rPr>
+          <w:lang w:val="uk-UA"/>
+        </w:rPr>
+        <w:t xml:space="preserve">та вихідної ознаки </w:t>
+      </w:r>
+      <w:r>
+        <w:rPr>
+          <w:lang w:val="en-US"/>
+        </w:rPr>
+        <w:t xml:space="preserve">Pep </w:t>
+      </w:r>
+      <w:r>
+        <w:rPr>
+          <w:lang w:val="uk-UA"/>
+        </w:rPr>
+        <w:t>дані виглядають як описано на малюнку нижче:</w:t>
+      </w:r>
+    </w:p>
+    <w:p>
+      <w:pPr>
+        <w:pStyle w:val="P1"/>
+        <w:rPr>
+          <w:lang w:val="uk-UA"/>
+        </w:rPr>
+      </w:pPr>
+      <w:r>
+        <w:rPr>
+          <w:lang w:val="uk-UA"/>
+        </w:rPr>
       </w:r>
     </w:p>
     <w:p>
@@ -947,7 +2356,7 @@
         <w:rPr/>
         <w:drawing>
           <wp:inline distT="0" distB="0" distL="0" distR="0">
-            <wp:extent cx="5731510" cy="6161405"/>
+            <wp:extent cx="5731510" cy="4319270"/>
             <wp:effectExtent l="0" t="0" r="0" b="0"/>
             <wp:docPr id="2" name="Зображення2"/>
             <wp:cNvGraphicFramePr>
@@ -963,7 +2372,7 @@
                     </pic:cNvPicPr>
                   </pic:nvPicPr>
                   <pic:blipFill>
-                    <a:blip r:embed="rId3"/>
+                    <a:blip r:embed="rId5"/>
                     <a:stretch>
                       <a:fillRect/>
                     </a:stretch>
@@ -971,7 +2380,7 @@
                   <pic:spPr bwMode="auto">
                     <a:xfrm>
                       <a:off x="0" y="0"/>
-                      <a:ext cx="5731510" cy="6161405"/>
+                      <a:ext cx="5731510" cy="4319270"/>
                     </a:xfrm>
                     <a:prstGeom prst="rect">
                       <a:avLst/>
@@ -992,341 +2401,16 @@
       </w:pPr>
       <w:r>
         <w:rPr/>
-        <w:t>Рисунок 1.2 — Описані атрибути вибірки</w:t>
-      </w:r>
-    </w:p>
-    <w:p>
-      <w:pPr>
-        <w:pStyle w:val="IMG1"/>
-        <w:rPr/>
-      </w:pPr>
-      <w:r>
-        <w:rPr/>
-      </w:r>
-    </w:p>
-    <w:p>
-      <w:pPr>
-        <w:pStyle w:val="p11"/>
-        <w:rPr>
-          <w:lang w:val="uk-UA"/>
-        </w:rPr>
-      </w:pPr>
-      <w:r>
-        <w:rPr>
-          <w:lang w:val="uk-UA"/>
-        </w:rPr>
-        <w:t xml:space="preserve">Типи дані визначені на вкладці </w:t>
-      </w:r>
-      <w:r>
-        <w:rPr>
-          <w:lang w:val="en-US"/>
-        </w:rPr>
-        <w:t xml:space="preserve">Preprocess. </w:t>
-      </w:r>
-      <w:r>
-        <w:rPr>
-          <w:lang w:val="uk-UA"/>
-        </w:rPr>
-        <w:t>Деталі на картинці нижче:</w:t>
-      </w:r>
-    </w:p>
-    <w:p>
-      <w:pPr>
-        <w:pStyle w:val="p11"/>
-        <w:rPr>
-          <w:lang w:val="uk-UA"/>
-        </w:rPr>
-      </w:pPr>
-      <w:r>
-        <w:rPr>
-          <w:lang w:val="uk-UA"/>
-        </w:rPr>
-      </w:r>
-    </w:p>
-    <w:p>
-      <w:pPr>
-        <w:pStyle w:val="IMG1"/>
-        <w:rPr/>
-      </w:pPr>
-      <w:r>
-        <w:rPr/>
-        <w:drawing>
-          <wp:inline distT="0" distB="0" distL="0" distR="0">
-            <wp:extent cx="5731510" cy="6161405"/>
-            <wp:effectExtent l="0" t="0" r="0" b="0"/>
-            <wp:docPr id="3" name="Зображення3"/>
-            <wp:cNvGraphicFramePr>
-              <a:graphicFrameLocks xmlns:a="http://schemas.openxmlformats.org/drawingml/2006/main" noChangeAspect="1"/>
-            </wp:cNvGraphicFramePr>
-            <a:graphic xmlns:a="http://schemas.openxmlformats.org/drawingml/2006/main">
-              <a:graphicData uri="http://schemas.openxmlformats.org/drawingml/2006/picture">
-                <pic:pic xmlns:pic="http://schemas.openxmlformats.org/drawingml/2006/picture">
-                  <pic:nvPicPr>
-                    <pic:cNvPr id="3" name="Зображення3"/>
-                    <pic:cNvPicPr>
-                      <a:picLocks noChangeAspect="1" noChangeArrowheads="1"/>
-                    </pic:cNvPicPr>
-                  </pic:nvPicPr>
-                  <pic:blipFill>
-                    <a:blip r:embed="rId4"/>
-                    <a:stretch>
-                      <a:fillRect/>
-                    </a:stretch>
-                  </pic:blipFill>
-                  <pic:spPr bwMode="auto">
-                    <a:xfrm>
-                      <a:off x="0" y="0"/>
-                      <a:ext cx="5731510" cy="6161405"/>
-                    </a:xfrm>
-                    <a:prstGeom prst="rect">
-                      <a:avLst/>
-                    </a:prstGeom>
-                    <a:noFill/>
-                  </pic:spPr>
-                </pic:pic>
-              </a:graphicData>
-            </a:graphic>
-          </wp:inline>
-        </w:drawing>
-      </w:r>
-    </w:p>
-    <w:p>
-      <w:pPr>
-        <w:pStyle w:val="IMG1"/>
-        <w:rPr/>
-      </w:pPr>
-      <w:r>
-        <w:rPr/>
-        <w:t>Рисунок 1.3 — Типи даних</w:t>
-      </w:r>
-    </w:p>
-    <w:p>
-      <w:pPr>
-        <w:pStyle w:val="p11"/>
-        <w:rPr>
-          <w:lang w:val="uk-UA"/>
-        </w:rPr>
-      </w:pPr>
-      <w:r>
-        <w:rPr>
-          <w:lang w:val="uk-UA"/>
-        </w:rPr>
-      </w:r>
-    </w:p>
-    <w:p>
-      <w:pPr>
-        <w:pStyle w:val="p11"/>
-        <w:rPr>
-          <w:lang w:val="uk-UA"/>
-        </w:rPr>
-      </w:pPr>
-      <w:r>
-        <w:rPr>
-          <w:lang w:val="uk-UA"/>
-        </w:rPr>
-        <w:t xml:space="preserve">Цільовим атрибутом є </w:t>
-      </w:r>
-      <w:r>
-        <w:rPr>
-          <w:lang w:val="en-US"/>
-        </w:rPr>
-        <w:t xml:space="preserve">class. </w:t>
-      </w:r>
-      <w:r>
-        <w:rPr>
-          <w:lang w:val="uk-UA"/>
-        </w:rPr>
-        <w:t xml:space="preserve">Він приймає значення </w:t>
-      </w:r>
-      <w:r>
-        <w:rPr>
-          <w:lang w:val="en-US"/>
-        </w:rPr>
-        <w:t xml:space="preserve">iris-setosa, iris-versicolor, iris-virginica. </w:t>
-      </w:r>
-      <w:r>
-        <w:rPr>
-          <w:lang w:val="uk-UA"/>
-        </w:rPr>
-        <w:t>Класи рівно розподілені по 50 штук на кожен клас. Деталі на картинці нижче:</w:t>
-      </w:r>
-    </w:p>
-    <w:p>
-      <w:pPr>
-        <w:pStyle w:val="IMG1"/>
-        <w:rPr/>
-      </w:pPr>
-      <w:r>
-        <w:rPr/>
-      </w:r>
-    </w:p>
-    <w:p>
-      <w:pPr>
-        <w:pStyle w:val="IMG1"/>
-        <w:rPr/>
-      </w:pPr>
-      <w:r>
-        <w:rPr/>
-        <w:drawing>
-          <wp:inline distT="0" distB="0" distL="0" distR="0">
-            <wp:extent cx="5731510" cy="6161405"/>
-            <wp:effectExtent l="0" t="0" r="0" b="0"/>
-            <wp:docPr id="4" name="Зображення4"/>
-            <wp:cNvGraphicFramePr>
-              <a:graphicFrameLocks xmlns:a="http://schemas.openxmlformats.org/drawingml/2006/main" noChangeAspect="1"/>
-            </wp:cNvGraphicFramePr>
-            <a:graphic xmlns:a="http://schemas.openxmlformats.org/drawingml/2006/main">
-              <a:graphicData uri="http://schemas.openxmlformats.org/drawingml/2006/picture">
-                <pic:pic xmlns:pic="http://schemas.openxmlformats.org/drawingml/2006/picture">
-                  <pic:nvPicPr>
-                    <pic:cNvPr id="4" name="Зображення4"/>
-                    <pic:cNvPicPr>
-                      <a:picLocks noChangeAspect="1" noChangeArrowheads="1"/>
-                    </pic:cNvPicPr>
-                  </pic:nvPicPr>
-                  <pic:blipFill>
-                    <a:blip r:embed="rId5"/>
-                    <a:stretch>
-                      <a:fillRect/>
-                    </a:stretch>
-                  </pic:blipFill>
-                  <pic:spPr bwMode="auto">
-                    <a:xfrm>
-                      <a:off x="0" y="0"/>
-                      <a:ext cx="5731510" cy="6161405"/>
-                    </a:xfrm>
-                    <a:prstGeom prst="rect">
-                      <a:avLst/>
-                    </a:prstGeom>
-                    <a:noFill/>
-                  </pic:spPr>
-                </pic:pic>
-              </a:graphicData>
-            </a:graphic>
-          </wp:inline>
-        </w:drawing>
-      </w:r>
-    </w:p>
-    <w:p>
-      <w:pPr>
-        <w:pStyle w:val="IMG1"/>
-        <w:rPr/>
-      </w:pPr>
-      <w:r>
-        <w:rPr/>
-        <w:t>Рисунок 1.4 — Розподіл класів</w:t>
-      </w:r>
-    </w:p>
-    <w:p>
-      <w:pPr>
-        <w:pStyle w:val="p11"/>
-        <w:rPr>
-          <w:lang w:val="uk-UA"/>
-        </w:rPr>
-      </w:pPr>
-      <w:r>
-        <w:rPr>
-          <w:lang w:val="uk-UA"/>
-        </w:rPr>
-      </w:r>
-    </w:p>
-    <w:p>
-      <w:pPr>
-        <w:pStyle w:val="p11"/>
-        <w:rPr>
-          <w:lang w:val="uk-UA"/>
-        </w:rPr>
-      </w:pPr>
-      <w:r>
-        <w:rPr>
-          <w:lang w:val="uk-UA"/>
-        </w:rPr>
-        <w:t xml:space="preserve">Графічно дані можна подати на вкладці </w:t>
-      </w:r>
-      <w:r>
-        <w:rPr>
-          <w:lang w:val="en-US"/>
-        </w:rPr>
-        <w:t>Visualize:</w:t>
-      </w:r>
-    </w:p>
-    <w:p>
-      <w:pPr>
-        <w:pStyle w:val="IMG1"/>
-        <w:rPr/>
-      </w:pPr>
-      <w:r>
-        <w:rPr/>
-      </w:r>
-    </w:p>
-    <w:p>
-      <w:pPr>
-        <w:pStyle w:val="IMG1"/>
-        <w:rPr/>
-      </w:pPr>
-      <w:r>
-        <w:rPr/>
-        <w:drawing>
-          <wp:inline distT="0" distB="0" distL="0" distR="0">
-            <wp:extent cx="5731510" cy="6161405"/>
-            <wp:effectExtent l="0" t="0" r="0" b="0"/>
-            <wp:docPr id="5" name="Зображення5"/>
-            <wp:cNvGraphicFramePr>
-              <a:graphicFrameLocks xmlns:a="http://schemas.openxmlformats.org/drawingml/2006/main" noChangeAspect="1"/>
-            </wp:cNvGraphicFramePr>
-            <a:graphic xmlns:a="http://schemas.openxmlformats.org/drawingml/2006/main">
-              <a:graphicData uri="http://schemas.openxmlformats.org/drawingml/2006/picture">
-                <pic:pic xmlns:pic="http://schemas.openxmlformats.org/drawingml/2006/picture">
-                  <pic:nvPicPr>
-                    <pic:cNvPr id="5" name="Зображення5"/>
-                    <pic:cNvPicPr>
-                      <a:picLocks noChangeAspect="1" noChangeArrowheads="1"/>
-                    </pic:cNvPicPr>
-                  </pic:nvPicPr>
-                  <pic:blipFill>
-                    <a:blip r:embed="rId6"/>
-                    <a:stretch>
-                      <a:fillRect/>
-                    </a:stretch>
-                  </pic:blipFill>
-                  <pic:spPr bwMode="auto">
-                    <a:xfrm>
-                      <a:off x="0" y="0"/>
-                      <a:ext cx="5731510" cy="6161405"/>
-                    </a:xfrm>
-                    <a:prstGeom prst="rect">
-                      <a:avLst/>
-                    </a:prstGeom>
-                    <a:noFill/>
-                  </pic:spPr>
-                </pic:pic>
-              </a:graphicData>
-            </a:graphic>
-          </wp:inline>
-        </w:drawing>
-      </w:r>
-    </w:p>
-    <w:p>
-      <w:pPr>
-        <w:pStyle w:val="IMG1"/>
-        <w:rPr/>
-      </w:pPr>
-      <w:r>
-        <w:rPr/>
-        <w:t>Рисунок 1.5 — Графічно подані дані</w:t>
-      </w:r>
-    </w:p>
-    <w:p>
-      <w:pPr>
-        <w:pStyle w:val="p11"/>
-        <w:rPr>
-          <w:lang w:val="uk-UA"/>
-        </w:rPr>
-      </w:pPr>
-      <w:r>
-        <w:rPr>
-          <w:lang w:val="uk-UA"/>
-        </w:rPr>
+        <w:t>Рисунок 1.2 — Графічний вигляд даних</w:t>
+      </w:r>
+    </w:p>
+    <w:p>
+      <w:pPr>
+        <w:pStyle w:val="P1"/>
+        <w:rPr/>
+      </w:pPr>
+      <w:r>
+        <w:rPr/>
       </w:r>
     </w:p>
     <w:p>
@@ -1687,7 +2771,7 @@
         </w:rPr>
         <w:t xml:space="preserve">Джерело: </w:t>
       </w:r>
-      <w:hyperlink r:id="rId7">
+      <w:hyperlink r:id="rId6">
         <w:r>
           <w:rPr>
             <w:rStyle w:val="Hyperlink"/>
@@ -2962,13 +4046,13 @@
       <w:lang w:val="en-US" w:eastAsia="uk-UA"/>
     </w:rPr>
   </w:style>
+  <w:style w:type="character" w:styleId="user">
+    <w:name w:val="Символ нумерації (user)"/>
+    <w:qFormat/>
+    <w:rPr/>
+  </w:style>
   <w:style w:type="character" w:styleId="Style12">
-    <w:name w:val="Символ нумерації"/>
-    <w:qFormat/>
-    <w:rPr/>
-  </w:style>
-  <w:style w:type="character" w:styleId="user">
-    <w:name w:val="Маркери (user)"/>
+    <w:name w:val="Маркери"/>
     <w:qFormat/>
     <w:rPr>
       <w:rFonts w:ascii="OpenSymbol" w:hAnsi="OpenSymbol" w:eastAsia="OpenSymbol" w:cs="OpenSymbol"/>
@@ -2984,7 +4068,7 @@
       <w:spacing w:before="240" w:after="120"/>
     </w:pPr>
     <w:rPr>
-      <w:rFonts w:ascii="Liberation Sans" w:hAnsi="Liberation Sans" w:eastAsia="Microsoft YaHei" w:cs="Lucida Sans"/>
+      <w:rFonts w:ascii="Liberation Sans" w:hAnsi="Liberation Sans" w:eastAsia="Microsoft YaHei" w:cs="Arial Unicode MS"/>
       <w:sz w:val="28"/>
       <w:szCs w:val="28"/>
     </w:rPr>
@@ -3029,7 +4113,7 @@
       <w:suppressLineNumbers/>
     </w:pPr>
     <w:rPr>
-      <w:rFonts w:cs="Lucida Sans"/>
+      <w:rFonts w:cs="Arial Unicode MS"/>
     </w:rPr>
   </w:style>
   <w:style w:type="paragraph" w:styleId="user1">
@@ -3042,7 +4126,7 @@
       <w:spacing w:before="240" w:after="120"/>
     </w:pPr>
     <w:rPr>
-      <w:rFonts w:ascii="Liberation Sans" w:hAnsi="Liberation Sans" w:eastAsia="Microsoft YaHei" w:cs="Arial Unicode MS"/>
+      <w:rFonts w:ascii="Liberation Sans" w:hAnsi="Liberation Sans" w:eastAsia="Microsoft YaHei" w:cs="Lucida Sans"/>
       <w:sz w:val="28"/>
       <w:szCs w:val="28"/>
     </w:rPr>
@@ -3055,12 +4139,12 @@
       <w:suppressLineNumbers/>
     </w:pPr>
     <w:rPr>
-      <w:rFonts w:cs="Arial Unicode MS"/>
+      <w:rFonts w:cs="Lucida Sans"/>
     </w:rPr>
   </w:style>
   <w:style w:type="paragraph" w:styleId="IndexHeading">
     <w:name w:val="index heading"/>
-    <w:basedOn w:val="user1"/>
+    <w:basedOn w:val="Style13"/>
     <w:pPr/>
     <w:rPr/>
   </w:style>
@@ -3344,12 +4428,14 @@
     <w:qFormat/>
     <w:pPr>
       <w:spacing w:lineRule="auto" w:line="360" w:before="0" w:after="0"/>
-      <w:ind w:firstLine="851"/>
+      <w:ind w:hanging="0"/>
+      <w:jc w:val="center"/>
+      <w:textAlignment w:val="center"/>
     </w:pPr>
     <w:rPr>
       <w:rFonts w:ascii="Times New Roman" w:hAnsi="Times New Roman"/>
       <w:b/>
-      <w:smallCaps/>
+      <w:caps/>
       <w:color w:val="auto"/>
       <w:sz w:val="28"/>
     </w:rPr>
@@ -3365,8 +4451,18 @@
     </w:pPr>
     <w:rPr/>
   </w:style>
-  <w:style w:type="numbering" w:styleId="user3" w:default="1">
-    <w:name w:val="Без маркерів (user)"/>
+  <w:style w:type="paragraph" w:styleId="Style15">
+    <w:name w:val="Вміст таблиці"/>
+    <w:basedOn w:val="Normal"/>
+    <w:qFormat/>
+    <w:pPr>
+      <w:widowControl w:val="false"/>
+      <w:suppressLineNumbers/>
+    </w:pPr>
+    <w:rPr/>
+  </w:style>
+  <w:style w:type="numbering" w:styleId="Style16" w:default="1">
+    <w:name w:val="Без маркерів"/>
     <w:uiPriority w:val="99"/>
     <w:semiHidden/>
     <w:unhideWhenUsed/>

</xml_diff>